<commit_message>
update tugas kewirausahaan digiplan
</commit_message>
<xml_diff>
--- a/TUGAS KEWIRAUSAHAAN_A_Digiplan.docx
+++ b/TUGAS KEWIRAUSAHAAN_A_Digiplan.docx
@@ -8,23 +8,17 @@
         <w:jc w:val="center"/>
         <w:rPr>
           <w:rFonts w:ascii="Times New Roman" w:hAnsi="Times New Roman" w:cs="Times New Roman"/>
+          <w:color w:val="000000" w:themeColor="text1"/>
         </w:rPr>
       </w:pPr>
       <w:r>
         <w:rPr>
           <w:rFonts w:ascii="Times New Roman" w:eastAsia="Times New Roman" w:hAnsi="Times New Roman" w:cs="Times New Roman"/>
           <w:b/>
+          <w:color w:val="000000" w:themeColor="text1"/>
           <w:sz w:val="48"/>
         </w:rPr>
-        <w:t xml:space="preserve">TUGAS </w:t>
-      </w:r>
-      <w:r>
-        <w:rPr>
-          <w:rFonts w:ascii="Times New Roman" w:eastAsia="Times New Roman" w:hAnsi="Times New Roman" w:cs="Times New Roman"/>
-          <w:b/>
-          <w:sz w:val="48"/>
-        </w:rPr>
-        <w:t>KEWIRAUSAHAAN</w:t>
+        <w:t>TUGAS KEWIRAUSAHAAN</w:t>
       </w:r>
     </w:p>
     <w:p>
@@ -34,31 +28,17 @@
         <w:jc w:val="center"/>
         <w:rPr>
           <w:rFonts w:ascii="Times New Roman" w:hAnsi="Times New Roman" w:cs="Times New Roman"/>
+          <w:color w:val="000000" w:themeColor="text1"/>
         </w:rPr>
       </w:pPr>
       <w:r>
         <w:rPr>
           <w:rFonts w:ascii="Times New Roman" w:eastAsia="Times New Roman" w:hAnsi="Times New Roman" w:cs="Times New Roman"/>
           <w:b/>
+          <w:color w:val="000000" w:themeColor="text1"/>
           <w:sz w:val="30"/>
         </w:rPr>
-        <w:t>“TUGAS 1–</w:t>
-      </w:r>
-      <w:r>
-        <w:rPr>
-          <w:rFonts w:ascii="Times New Roman" w:eastAsia="Times New Roman" w:hAnsi="Times New Roman" w:cs="Times New Roman"/>
-          <w:b/>
-          <w:sz w:val="30"/>
-        </w:rPr>
-        <w:t>PENGUMPULAN NAMA KELOMPOK</w:t>
-      </w:r>
-      <w:r>
-        <w:rPr>
-          <w:rFonts w:ascii="Times New Roman" w:eastAsia="Times New Roman" w:hAnsi="Times New Roman" w:cs="Times New Roman"/>
-          <w:b/>
-          <w:sz w:val="30"/>
-        </w:rPr>
-        <w:t>“</w:t>
+        <w:t>“TUGAS 1–PENGUMPULAN NAMA KELOMPOK“</w:t>
       </w:r>
     </w:p>
     <w:p>
@@ -67,12 +47,14 @@
         <w:ind w:left="2430"/>
         <w:rPr>
           <w:rFonts w:ascii="Times New Roman" w:hAnsi="Times New Roman" w:cs="Times New Roman"/>
+          <w:color w:val="000000" w:themeColor="text1"/>
         </w:rPr>
       </w:pPr>
       <w:r>
         <w:rPr>
           <w:rFonts w:ascii="Times New Roman" w:hAnsi="Times New Roman" w:cs="Times New Roman"/>
           <w:noProof/>
+          <w:color w:val="000000" w:themeColor="text1"/>
         </w:rPr>
         <w:drawing>
           <wp:inline distT="0" distB="0" distL="0" distR="0" wp14:anchorId="1146D2C2" wp14:editId="65101E30">
@@ -116,12 +98,14 @@
         <w:jc w:val="center"/>
         <w:rPr>
           <w:rFonts w:ascii="Times New Roman" w:eastAsia="Times New Roman" w:hAnsi="Times New Roman" w:cs="Times New Roman"/>
+          <w:color w:val="000000" w:themeColor="text1"/>
           <w:sz w:val="26"/>
         </w:rPr>
       </w:pPr>
       <w:r>
         <w:rPr>
           <w:rFonts w:ascii="Times New Roman" w:eastAsia="Times New Roman" w:hAnsi="Times New Roman" w:cs="Times New Roman"/>
+          <w:color w:val="000000" w:themeColor="text1"/>
           <w:sz w:val="26"/>
         </w:rPr>
         <w:t xml:space="preserve">DIGIPLAN </w:t>
@@ -134,6 +118,7 @@
         <w:jc w:val="center"/>
         <w:rPr>
           <w:rFonts w:ascii="Times New Roman" w:eastAsia="Times New Roman" w:hAnsi="Times New Roman" w:cs="Times New Roman"/>
+          <w:color w:val="000000" w:themeColor="text1"/>
           <w:sz w:val="26"/>
         </w:rPr>
       </w:pPr>
@@ -145,12 +130,14 @@
         <w:jc w:val="center"/>
         <w:rPr>
           <w:rFonts w:ascii="Times New Roman" w:eastAsia="Times New Roman" w:hAnsi="Times New Roman" w:cs="Times New Roman"/>
+          <w:color w:val="000000" w:themeColor="text1"/>
           <w:sz w:val="26"/>
         </w:rPr>
       </w:pPr>
       <w:r>
         <w:rPr>
           <w:rFonts w:ascii="Times New Roman" w:eastAsia="Times New Roman" w:hAnsi="Times New Roman" w:cs="Times New Roman"/>
+          <w:color w:val="000000" w:themeColor="text1"/>
           <w:sz w:val="26"/>
         </w:rPr>
         <w:t>1.⁠ ⁠Muhamad Rasha Zein - 4525210042</w:t>
@@ -163,31 +150,17 @@
         <w:jc w:val="center"/>
         <w:rPr>
           <w:rFonts w:ascii="Times New Roman" w:eastAsia="Times New Roman" w:hAnsi="Times New Roman" w:cs="Times New Roman"/>
+          <w:color w:val="000000" w:themeColor="text1"/>
           <w:sz w:val="26"/>
         </w:rPr>
       </w:pPr>
       <w:r>
         <w:rPr>
           <w:rFonts w:ascii="Times New Roman" w:eastAsia="Times New Roman" w:hAnsi="Times New Roman" w:cs="Times New Roman"/>
+          <w:color w:val="000000" w:themeColor="text1"/>
           <w:sz w:val="26"/>
         </w:rPr>
-        <w:t>2.⁠ ⁠</w:t>
-      </w:r>
-      <w:proofErr w:type="spellStart"/>
-      <w:r>
-        <w:rPr>
-          <w:rFonts w:ascii="Times New Roman" w:eastAsia="Times New Roman" w:hAnsi="Times New Roman" w:cs="Times New Roman"/>
-          <w:sz w:val="26"/>
-        </w:rPr>
-        <w:t>Dzikrullah</w:t>
-      </w:r>
-      <w:proofErr w:type="spellEnd"/>
-      <w:r>
-        <w:rPr>
-          <w:rFonts w:ascii="Times New Roman" w:eastAsia="Times New Roman" w:hAnsi="Times New Roman" w:cs="Times New Roman"/>
-          <w:sz w:val="26"/>
-        </w:rPr>
-        <w:t xml:space="preserve"> Surachman - 4524210029</w:t>
+        <w:t>2.⁠ ⁠Dzikrullah Surachman - 4524210029</w:t>
       </w:r>
     </w:p>
     <w:p>
@@ -197,31 +170,17 @@
         <w:jc w:val="center"/>
         <w:rPr>
           <w:rFonts w:ascii="Times New Roman" w:eastAsia="Times New Roman" w:hAnsi="Times New Roman" w:cs="Times New Roman"/>
+          <w:color w:val="000000" w:themeColor="text1"/>
           <w:sz w:val="26"/>
         </w:rPr>
       </w:pPr>
       <w:r>
         <w:rPr>
           <w:rFonts w:ascii="Times New Roman" w:eastAsia="Times New Roman" w:hAnsi="Times New Roman" w:cs="Times New Roman"/>
+          <w:color w:val="000000" w:themeColor="text1"/>
           <w:sz w:val="26"/>
         </w:rPr>
-        <w:t xml:space="preserve">3.⁠ ⁠Ririn </w:t>
-      </w:r>
-      <w:proofErr w:type="spellStart"/>
-      <w:r>
-        <w:rPr>
-          <w:rFonts w:ascii="Times New Roman" w:eastAsia="Times New Roman" w:hAnsi="Times New Roman" w:cs="Times New Roman"/>
-          <w:sz w:val="26"/>
-        </w:rPr>
-        <w:t>Verdawati</w:t>
-      </w:r>
-      <w:proofErr w:type="spellEnd"/>
-      <w:r>
-        <w:rPr>
-          <w:rFonts w:ascii="Times New Roman" w:eastAsia="Times New Roman" w:hAnsi="Times New Roman" w:cs="Times New Roman"/>
-          <w:sz w:val="26"/>
-        </w:rPr>
-        <w:t xml:space="preserve"> - 4524210090</w:t>
+        <w:t>3.⁠ ⁠Ririn Verdawati - 4524210090</w:t>
       </w:r>
     </w:p>
     <w:p>
@@ -231,12 +190,14 @@
         <w:jc w:val="center"/>
         <w:rPr>
           <w:rFonts w:ascii="Times New Roman" w:eastAsia="Times New Roman" w:hAnsi="Times New Roman" w:cs="Times New Roman"/>
+          <w:color w:val="000000" w:themeColor="text1"/>
           <w:sz w:val="26"/>
         </w:rPr>
       </w:pPr>
       <w:r>
         <w:rPr>
           <w:rFonts w:ascii="Times New Roman" w:eastAsia="Times New Roman" w:hAnsi="Times New Roman" w:cs="Times New Roman"/>
+          <w:color w:val="000000" w:themeColor="text1"/>
           <w:sz w:val="26"/>
         </w:rPr>
         <w:t>4.⁠ ⁠⁠Elsa Setia Marcsa - 4524210030</w:t>
@@ -249,45 +210,17 @@
         <w:jc w:val="center"/>
         <w:rPr>
           <w:rFonts w:ascii="Times New Roman" w:eastAsia="Times New Roman" w:hAnsi="Times New Roman" w:cs="Times New Roman"/>
+          <w:color w:val="000000" w:themeColor="text1"/>
           <w:sz w:val="26"/>
         </w:rPr>
       </w:pPr>
       <w:r>
         <w:rPr>
           <w:rFonts w:ascii="Times New Roman" w:eastAsia="Times New Roman" w:hAnsi="Times New Roman" w:cs="Times New Roman"/>
+          <w:color w:val="000000" w:themeColor="text1"/>
           <w:sz w:val="26"/>
         </w:rPr>
-        <w:t xml:space="preserve">5.⁠ ⁠Khairul Adam </w:t>
-      </w:r>
-      <w:proofErr w:type="spellStart"/>
-      <w:r>
-        <w:rPr>
-          <w:rFonts w:ascii="Times New Roman" w:eastAsia="Times New Roman" w:hAnsi="Times New Roman" w:cs="Times New Roman"/>
-          <w:sz w:val="26"/>
-        </w:rPr>
-        <w:t>efendi</w:t>
-      </w:r>
-      <w:proofErr w:type="spellEnd"/>
-      <w:r>
-        <w:rPr>
-          <w:rFonts w:ascii="Times New Roman" w:eastAsia="Times New Roman" w:hAnsi="Times New Roman" w:cs="Times New Roman"/>
-          <w:sz w:val="26"/>
-        </w:rPr>
-        <w:t xml:space="preserve"> </w:t>
-      </w:r>
-      <w:r>
-        <w:rPr>
-          <w:rFonts w:ascii="Times New Roman" w:eastAsia="Times New Roman" w:hAnsi="Times New Roman" w:cs="Times New Roman"/>
-          <w:sz w:val="26"/>
-        </w:rPr>
-        <w:t>–</w:t>
-      </w:r>
-      <w:r>
-        <w:rPr>
-          <w:rFonts w:ascii="Times New Roman" w:eastAsia="Times New Roman" w:hAnsi="Times New Roman" w:cs="Times New Roman"/>
-          <w:sz w:val="26"/>
-        </w:rPr>
-        <w:t xml:space="preserve"> 4525210035</w:t>
+        <w:t>5.⁠ ⁠Khairul Adam efendi – 4525210035</w:t>
       </w:r>
     </w:p>
     <w:p>
@@ -297,6 +230,7 @@
         <w:jc w:val="center"/>
         <w:rPr>
           <w:rFonts w:ascii="Times New Roman" w:eastAsia="Times New Roman" w:hAnsi="Times New Roman" w:cs="Times New Roman"/>
+          <w:color w:val="000000" w:themeColor="text1"/>
           <w:sz w:val="26"/>
         </w:rPr>
       </w:pPr>
@@ -308,31 +242,17 @@
         <w:jc w:val="center"/>
         <w:rPr>
           <w:rFonts w:ascii="Times New Roman" w:eastAsia="Times New Roman" w:hAnsi="Times New Roman" w:cs="Times New Roman"/>
+          <w:color w:val="000000" w:themeColor="text1"/>
           <w:sz w:val="26"/>
         </w:rPr>
       </w:pPr>
       <w:r>
         <w:rPr>
           <w:rFonts w:ascii="Times New Roman" w:eastAsia="Times New Roman" w:hAnsi="Times New Roman" w:cs="Times New Roman"/>
+          <w:color w:val="000000" w:themeColor="text1"/>
           <w:sz w:val="26"/>
         </w:rPr>
-        <w:t xml:space="preserve">Dosen </w:t>
-      </w:r>
-      <w:proofErr w:type="spellStart"/>
-      <w:r>
-        <w:rPr>
-          <w:rFonts w:ascii="Times New Roman" w:eastAsia="Times New Roman" w:hAnsi="Times New Roman" w:cs="Times New Roman"/>
-          <w:sz w:val="26"/>
-        </w:rPr>
-        <w:t>Pengampu</w:t>
-      </w:r>
-      <w:proofErr w:type="spellEnd"/>
-      <w:r>
-        <w:rPr>
-          <w:rFonts w:ascii="Times New Roman" w:eastAsia="Times New Roman" w:hAnsi="Times New Roman" w:cs="Times New Roman"/>
-          <w:sz w:val="26"/>
-        </w:rPr>
-        <w:t xml:space="preserve"> :</w:t>
+        <w:t>Dosen Pengampu :</w:t>
       </w:r>
     </w:p>
     <w:p>
@@ -342,59 +262,21 @@
         <w:jc w:val="center"/>
         <w:rPr>
           <w:rFonts w:ascii="Times New Roman" w:hAnsi="Times New Roman" w:cs="Times New Roman"/>
-        </w:rPr>
-      </w:pPr>
-      <w:r>
-        <w:rPr>
-          <w:rFonts w:ascii="Times New Roman" w:eastAsia="Times New Roman" w:hAnsi="Times New Roman" w:cs="Times New Roman"/>
+          <w:color w:val="000000" w:themeColor="text1"/>
+        </w:rPr>
+      </w:pPr>
+      <w:r>
+        <w:rPr>
+          <w:rFonts w:ascii="Times New Roman" w:eastAsia="Times New Roman" w:hAnsi="Times New Roman" w:cs="Times New Roman"/>
+          <w:color w:val="000000" w:themeColor="text1"/>
           <w:sz w:val="26"/>
         </w:rPr>
-        <w:t xml:space="preserve">Adi Wahyu </w:t>
-      </w:r>
-      <w:proofErr w:type="spellStart"/>
-      <w:r>
-        <w:rPr>
-          <w:rFonts w:ascii="Times New Roman" w:eastAsia="Times New Roman" w:hAnsi="Times New Roman" w:cs="Times New Roman"/>
-          <w:sz w:val="26"/>
-        </w:rPr>
-        <w:t>Pribadi</w:t>
-      </w:r>
-      <w:proofErr w:type="spellEnd"/>
-      <w:r>
-        <w:rPr>
-          <w:rFonts w:ascii="Times New Roman" w:eastAsia="Times New Roman" w:hAnsi="Times New Roman" w:cs="Times New Roman"/>
-          <w:sz w:val="26"/>
-        </w:rPr>
-        <w:t xml:space="preserve">, </w:t>
-      </w:r>
-      <w:proofErr w:type="spellStart"/>
-      <w:r>
-        <w:rPr>
-          <w:rFonts w:ascii="Times New Roman" w:eastAsia="Times New Roman" w:hAnsi="Times New Roman" w:cs="Times New Roman"/>
-          <w:sz w:val="26"/>
-        </w:rPr>
-        <w:t>S.Si</w:t>
-      </w:r>
-      <w:proofErr w:type="spellEnd"/>
-      <w:r>
-        <w:rPr>
-          <w:rFonts w:ascii="Times New Roman" w:eastAsia="Times New Roman" w:hAnsi="Times New Roman" w:cs="Times New Roman"/>
-          <w:sz w:val="26"/>
-        </w:rPr>
-        <w:t xml:space="preserve">., </w:t>
-      </w:r>
-      <w:proofErr w:type="spellStart"/>
-      <w:r>
-        <w:rPr>
-          <w:rFonts w:ascii="Times New Roman" w:eastAsia="Times New Roman" w:hAnsi="Times New Roman" w:cs="Times New Roman"/>
-          <w:sz w:val="26"/>
-        </w:rPr>
-        <w:t>M.Kom</w:t>
-      </w:r>
-      <w:proofErr w:type="spellEnd"/>
-      <w:r>
-        <w:rPr>
-          <w:rFonts w:ascii="Times New Roman" w:hAnsi="Times New Roman" w:cs="Times New Roman"/>
+        <w:t>Adi Wahyu Pribadi, S.Si., M.Kom</w:t>
+      </w:r>
+      <w:r>
+        <w:rPr>
+          <w:rFonts w:ascii="Times New Roman" w:hAnsi="Times New Roman" w:cs="Times New Roman"/>
+          <w:color w:val="000000" w:themeColor="text1"/>
         </w:rPr>
         <w:t xml:space="preserve"> </w:t>
       </w:r>
@@ -406,26 +288,18 @@
         <w:jc w:val="center"/>
         <w:rPr>
           <w:rFonts w:ascii="Times New Roman" w:hAnsi="Times New Roman" w:cs="Times New Roman"/>
+          <w:color w:val="000000" w:themeColor="text1"/>
         </w:rPr>
       </w:pPr>
       <w:r>
         <w:rPr>
           <w:rFonts w:ascii="Times New Roman" w:eastAsia="Times New Roman" w:hAnsi="Times New Roman" w:cs="Times New Roman"/>
           <w:b/>
+          <w:color w:val="000000" w:themeColor="text1"/>
           <w:sz w:val="32"/>
         </w:rPr>
-        <w:t xml:space="preserve">S1-Teknik </w:t>
-      </w:r>
-      <w:proofErr w:type="spellStart"/>
-      <w:r>
-        <w:rPr>
-          <w:rFonts w:ascii="Times New Roman" w:eastAsia="Times New Roman" w:hAnsi="Times New Roman" w:cs="Times New Roman"/>
-          <w:b/>
-          <w:sz w:val="32"/>
-        </w:rPr>
-        <w:t>Informatika</w:t>
-      </w:r>
-      <w:proofErr w:type="spellEnd"/>
+        <w:t>S1-Teknik Informatika</w:t>
+      </w:r>
     </w:p>
     <w:p>
       <w:pPr>
@@ -434,25 +308,17 @@
         <w:jc w:val="center"/>
         <w:rPr>
           <w:rFonts w:ascii="Times New Roman" w:hAnsi="Times New Roman" w:cs="Times New Roman"/>
-        </w:rPr>
-      </w:pPr>
-      <w:proofErr w:type="spellStart"/>
+          <w:color w:val="000000" w:themeColor="text1"/>
+        </w:rPr>
+      </w:pPr>
       <w:r>
         <w:rPr>
           <w:rFonts w:ascii="Times New Roman" w:eastAsia="Times New Roman" w:hAnsi="Times New Roman" w:cs="Times New Roman"/>
           <w:b/>
+          <w:color w:val="000000" w:themeColor="text1"/>
           <w:sz w:val="32"/>
         </w:rPr>
-        <w:t>Fakultas</w:t>
-      </w:r>
-      <w:proofErr w:type="spellEnd"/>
-      <w:r>
-        <w:rPr>
-          <w:rFonts w:ascii="Times New Roman" w:eastAsia="Times New Roman" w:hAnsi="Times New Roman" w:cs="Times New Roman"/>
-          <w:b/>
-          <w:sz w:val="32"/>
-        </w:rPr>
-        <w:t xml:space="preserve"> Teknik Universitas Pancasila</w:t>
+        <w:t>Fakultas Teknik Universitas Pancasila</w:t>
       </w:r>
     </w:p>
     <w:p>
@@ -462,12 +328,14 @@
         <w:jc w:val="center"/>
         <w:rPr>
           <w:rFonts w:ascii="Times New Roman" w:hAnsi="Times New Roman" w:cs="Times New Roman"/>
+          <w:color w:val="000000" w:themeColor="text1"/>
         </w:rPr>
       </w:pPr>
       <w:r>
         <w:rPr>
           <w:rFonts w:ascii="Times New Roman" w:eastAsia="Times New Roman" w:hAnsi="Times New Roman" w:cs="Times New Roman"/>
           <w:b/>
+          <w:color w:val="000000" w:themeColor="text1"/>
           <w:sz w:val="32"/>
         </w:rPr>
         <w:t>2025/2026</w:t>
@@ -477,37 +345,24 @@
       <w:pPr>
         <w:rPr>
           <w:rFonts w:ascii="Times New Roman" w:hAnsi="Times New Roman" w:cs="Times New Roman"/>
-        </w:rPr>
-      </w:pPr>
-    </w:p>
-    <w:p>
-      <w:pPr>
-        <w:rPr>
-          <w:rFonts w:ascii="Times New Roman" w:hAnsi="Times New Roman" w:cs="Times New Roman"/>
-        </w:rPr>
-      </w:pPr>
-    </w:p>
-    <w:p>
-      <w:pPr>
-        <w:jc w:val="both"/>
-        <w:rPr>
-          <w:rFonts w:ascii="Times New Roman" w:hAnsi="Times New Roman" w:cs="Times New Roman"/>
-        </w:rPr>
-      </w:pPr>
-    </w:p>
-    <w:p>
-      <w:pPr>
-        <w:rPr>
-          <w:rFonts w:ascii="Times New Roman" w:hAnsi="Times New Roman" w:cs="Times New Roman"/>
-        </w:rPr>
-      </w:pPr>
+          <w:color w:val="000000" w:themeColor="text1"/>
+        </w:rPr>
+      </w:pPr>
+      <w:r>
+        <w:rPr>
+          <w:rFonts w:ascii="Times New Roman" w:hAnsi="Times New Roman" w:cs="Times New Roman"/>
+          <w:color w:val="000000" w:themeColor="text1"/>
+        </w:rPr>
+        <w:lastRenderedPageBreak/>
+        <w:t xml:space="preserve">Tahapan wawancara sebelum menjadi tema : </w:t>
+      </w:r>
     </w:p>
     <w:p>
       <w:pPr>
         <w:spacing w:before="100" w:beforeAutospacing="1" w:after="100" w:afterAutospacing="1" w:line="240" w:lineRule="auto"/>
         <w:rPr>
           <w:rFonts w:ascii="Times New Roman" w:eastAsia="Times New Roman" w:hAnsi="Times New Roman" w:cs="Times New Roman"/>
-          <w:color w:val="auto"/>
+          <w:color w:val="000000" w:themeColor="text1"/>
           <w:kern w:val="0"/>
           <w:sz w:val="24"/>
           <w:lang w:val="id-ID" w:eastAsia="id-ID"/>
@@ -519,33 +374,448 @@
           <w:rFonts w:ascii="Times New Roman" w:eastAsia="Times New Roman" w:hAnsi="Times New Roman" w:cs="Times New Roman"/>
           <w:b/>
           <w:bCs/>
-          <w:color w:val="auto"/>
-          <w:kern w:val="0"/>
-          <w:sz w:val="24"/>
-          <w:lang w:val="id-ID" w:eastAsia="id-ID"/>
-          <w14:ligatures w14:val="none"/>
-        </w:rPr>
-        <w:t>problem utamanya adalah:</w:t>
-      </w:r>
-    </w:p>
-    <w:p>
-      <w:pPr>
-        <w:spacing w:before="100" w:beforeAutospacing="1" w:after="100" w:afterAutospacing="1" w:line="240" w:lineRule="auto"/>
-        <w:rPr>
-          <w:rFonts w:ascii="Times New Roman" w:eastAsia="Times New Roman" w:hAnsi="Times New Roman" w:cs="Times New Roman"/>
-          <w:color w:val="auto"/>
-          <w:kern w:val="0"/>
-          <w:sz w:val="24"/>
-          <w:lang w:val="id-ID" w:eastAsia="id-ID"/>
-          <w14:ligatures w14:val="none"/>
-        </w:rPr>
-      </w:pPr>
+          <w:color w:val="000000" w:themeColor="text1"/>
+          <w:kern w:val="0"/>
+          <w:sz w:val="24"/>
+          <w:lang w:val="id-ID" w:eastAsia="id-ID"/>
+          <w14:ligatures w14:val="none"/>
+        </w:rPr>
+        <w:t>Pewawancara:</w:t>
+      </w:r>
+      <w:r>
+        <w:rPr>
+          <w:rFonts w:ascii="Times New Roman" w:eastAsia="Times New Roman" w:hAnsi="Times New Roman" w:cs="Times New Roman"/>
+          <w:color w:val="000000" w:themeColor="text1"/>
+          <w:kern w:val="0"/>
+          <w:sz w:val="24"/>
+          <w:lang w:val="id-ID" w:eastAsia="id-ID"/>
+          <w14:ligatures w14:val="none"/>
+        </w:rPr>
+        <w:t xml:space="preserve"> Muhamad Rasha Zein</w:t>
+      </w:r>
+      <w:r>
+        <w:rPr>
+          <w:rFonts w:ascii="Times New Roman" w:eastAsia="Times New Roman" w:hAnsi="Times New Roman" w:cs="Times New Roman"/>
+          <w:color w:val="000000" w:themeColor="text1"/>
+          <w:kern w:val="0"/>
+          <w:sz w:val="24"/>
+          <w:lang w:val="id-ID" w:eastAsia="id-ID"/>
+          <w14:ligatures w14:val="none"/>
+        </w:rPr>
+        <w:br/>
+      </w:r>
       <w:r>
         <w:rPr>
           <w:rFonts w:ascii="Times New Roman" w:eastAsia="Times New Roman" w:hAnsi="Times New Roman" w:cs="Times New Roman"/>
           <w:b/>
           <w:bCs/>
-          <w:color w:val="auto"/>
+          <w:color w:val="000000" w:themeColor="text1"/>
+          <w:kern w:val="0"/>
+          <w:sz w:val="24"/>
+          <w:lang w:val="id-ID" w:eastAsia="id-ID"/>
+          <w14:ligatures w14:val="none"/>
+        </w:rPr>
+        <w:t>Narasumber:</w:t>
+      </w:r>
+      <w:r>
+        <w:rPr>
+          <w:rFonts w:ascii="Times New Roman" w:eastAsia="Times New Roman" w:hAnsi="Times New Roman" w:cs="Times New Roman"/>
+          <w:color w:val="000000" w:themeColor="text1"/>
+          <w:kern w:val="0"/>
+          <w:sz w:val="24"/>
+          <w:lang w:val="id-ID" w:eastAsia="id-ID"/>
+          <w14:ligatures w14:val="none"/>
+        </w:rPr>
+        <w:t xml:space="preserve"> Anra Maki Tihami (NPM: 4525210013)</w:t>
+      </w:r>
+    </w:p>
+    <w:p>
+      <w:pPr>
+        <w:spacing w:after="0" w:line="240" w:lineRule="auto"/>
+        <w:rPr>
+          <w:rFonts w:ascii="Times New Roman" w:eastAsia="Times New Roman" w:hAnsi="Times New Roman" w:cs="Times New Roman"/>
+          <w:color w:val="000000" w:themeColor="text1"/>
+          <w:kern w:val="0"/>
+          <w:sz w:val="24"/>
+          <w:lang w:val="id-ID" w:eastAsia="id-ID"/>
+          <w14:ligatures w14:val="none"/>
+        </w:rPr>
+      </w:pPr>
+      <w:r>
+        <w:rPr>
+          <w:noProof/>
+        </w:rPr>
+      </w:r>
+      <w:r>
+        <w:pict w14:anchorId="430CB685">
+          <v:rect id="Horizontal Line 1" o:spid="_x0000_s1026" style="width:451.3pt;height:.1pt;visibility:visible;mso-wrap-style:square;mso-left-percent:-10001;mso-top-percent:-10001;mso-position-horizontal:absolute;mso-position-horizontal-relative:char;mso-position-vertical:absolute;mso-position-vertical-relative:line;mso-left-percent:-10001;mso-top-percent:-10001;v-text-anchor:top" o:gfxdata="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" filled="f">
+            <o:lock v:ext="edit" rotation="t" aspectratio="t" verticies="t" text="t" shapetype="t"/>
+            <w10:anchorlock/>
+          </v:rect>
+        </w:pict>
+      </w:r>
+    </w:p>
+    <w:p>
+      <w:pPr>
+        <w:spacing w:before="100" w:beforeAutospacing="1" w:after="100" w:afterAutospacing="1" w:line="240" w:lineRule="auto"/>
+        <w:rPr>
+          <w:rFonts w:ascii="Times New Roman" w:eastAsia="Times New Roman" w:hAnsi="Times New Roman" w:cs="Times New Roman"/>
+          <w:color w:val="000000" w:themeColor="text1"/>
+          <w:kern w:val="0"/>
+          <w:sz w:val="24"/>
+          <w:lang w:val="id-ID" w:eastAsia="id-ID"/>
+          <w14:ligatures w14:val="none"/>
+        </w:rPr>
+      </w:pPr>
+      <w:r>
+        <w:rPr>
+          <w:rFonts w:ascii="Times New Roman" w:eastAsia="Times New Roman" w:hAnsi="Times New Roman" w:cs="Times New Roman"/>
+          <w:b/>
+          <w:bCs/>
+          <w:color w:val="000000" w:themeColor="text1"/>
+          <w:kern w:val="0"/>
+          <w:sz w:val="24"/>
+          <w:lang w:val="id-ID" w:eastAsia="id-ID"/>
+          <w14:ligatures w14:val="none"/>
+        </w:rPr>
+        <w:t>Rasha:</w:t>
+      </w:r>
+      <w:r>
+        <w:rPr>
+          <w:rFonts w:ascii="Times New Roman" w:eastAsia="Times New Roman" w:hAnsi="Times New Roman" w:cs="Times New Roman"/>
+          <w:color w:val="000000" w:themeColor="text1"/>
+          <w:kern w:val="0"/>
+          <w:sz w:val="24"/>
+          <w:lang w:val="id-ID" w:eastAsia="id-ID"/>
+          <w14:ligatures w14:val="none"/>
+        </w:rPr>
+        <w:t xml:space="preserve"> Selamat siang, Ra. Terima kasih sudah bersedia diwawancarai hari ini. Boleh perkenalkan diri dulu?</w:t>
+      </w:r>
+    </w:p>
+    <w:p>
+      <w:pPr>
+        <w:spacing w:before="100" w:beforeAutospacing="1" w:after="100" w:afterAutospacing="1" w:line="240" w:lineRule="auto"/>
+        <w:rPr>
+          <w:rFonts w:ascii="Times New Roman" w:eastAsia="Times New Roman" w:hAnsi="Times New Roman" w:cs="Times New Roman"/>
+          <w:color w:val="000000" w:themeColor="text1"/>
+          <w:kern w:val="0"/>
+          <w:sz w:val="24"/>
+          <w:lang w:val="id-ID" w:eastAsia="id-ID"/>
+          <w14:ligatures w14:val="none"/>
+        </w:rPr>
+      </w:pPr>
+      <w:r>
+        <w:rPr>
+          <w:rFonts w:ascii="Times New Roman" w:eastAsia="Times New Roman" w:hAnsi="Times New Roman" w:cs="Times New Roman"/>
+          <w:b/>
+          <w:bCs/>
+          <w:color w:val="000000" w:themeColor="text1"/>
+          <w:kern w:val="0"/>
+          <w:sz w:val="24"/>
+          <w:lang w:val="id-ID" w:eastAsia="id-ID"/>
+          <w14:ligatures w14:val="none"/>
+        </w:rPr>
+        <w:t>Anra:</w:t>
+      </w:r>
+      <w:r>
+        <w:rPr>
+          <w:rFonts w:ascii="Times New Roman" w:eastAsia="Times New Roman" w:hAnsi="Times New Roman" w:cs="Times New Roman"/>
+          <w:color w:val="000000" w:themeColor="text1"/>
+          <w:kern w:val="0"/>
+          <w:sz w:val="24"/>
+          <w:lang w:val="id-ID" w:eastAsia="id-ID"/>
+          <w14:ligatures w14:val="none"/>
+        </w:rPr>
+        <w:t xml:space="preserve"> Siang juga, Sha. Saya Anra Maki Tihami, NPM 4525210013, mahasiswa Teknik Informatika.</w:t>
+      </w:r>
+    </w:p>
+    <w:p>
+      <w:pPr>
+        <w:spacing w:before="100" w:beforeAutospacing="1" w:after="100" w:afterAutospacing="1" w:line="240" w:lineRule="auto"/>
+        <w:rPr>
+          <w:rFonts w:ascii="Times New Roman" w:eastAsia="Times New Roman" w:hAnsi="Times New Roman" w:cs="Times New Roman"/>
+          <w:color w:val="000000" w:themeColor="text1"/>
+          <w:kern w:val="0"/>
+          <w:sz w:val="24"/>
+          <w:lang w:val="id-ID" w:eastAsia="id-ID"/>
+          <w14:ligatures w14:val="none"/>
+        </w:rPr>
+      </w:pPr>
+      <w:r>
+        <w:rPr>
+          <w:rFonts w:ascii="Times New Roman" w:eastAsia="Times New Roman" w:hAnsi="Times New Roman" w:cs="Times New Roman"/>
+          <w:b/>
+          <w:bCs/>
+          <w:color w:val="000000" w:themeColor="text1"/>
+          <w:kern w:val="0"/>
+          <w:sz w:val="24"/>
+          <w:lang w:val="id-ID" w:eastAsia="id-ID"/>
+          <w14:ligatures w14:val="none"/>
+        </w:rPr>
+        <w:t>Rasha:</w:t>
+      </w:r>
+      <w:r>
+        <w:rPr>
+          <w:rFonts w:ascii="Times New Roman" w:eastAsia="Times New Roman" w:hAnsi="Times New Roman" w:cs="Times New Roman"/>
+          <w:color w:val="000000" w:themeColor="text1"/>
+          <w:kern w:val="0"/>
+          <w:sz w:val="24"/>
+          <w:lang w:val="id-ID" w:eastAsia="id-ID"/>
+          <w14:ligatures w14:val="none"/>
+        </w:rPr>
+        <w:t xml:space="preserve"> Kebetulan saya dengar kamu sering banget kelupaan soal tugas kuliah. Bisa cerita gimana ceritanya?</w:t>
+      </w:r>
+    </w:p>
+    <w:p>
+      <w:pPr>
+        <w:spacing w:before="100" w:beforeAutospacing="1" w:after="100" w:afterAutospacing="1" w:line="240" w:lineRule="auto"/>
+        <w:rPr>
+          <w:rFonts w:ascii="Times New Roman" w:eastAsia="Times New Roman" w:hAnsi="Times New Roman" w:cs="Times New Roman"/>
+          <w:color w:val="000000" w:themeColor="text1"/>
+          <w:kern w:val="0"/>
+          <w:sz w:val="24"/>
+          <w:lang w:val="id-ID" w:eastAsia="id-ID"/>
+          <w14:ligatures w14:val="none"/>
+        </w:rPr>
+      </w:pPr>
+      <w:r>
+        <w:rPr>
+          <w:rFonts w:ascii="Times New Roman" w:eastAsia="Times New Roman" w:hAnsi="Times New Roman" w:cs="Times New Roman"/>
+          <w:b/>
+          <w:bCs/>
+          <w:color w:val="000000" w:themeColor="text1"/>
+          <w:kern w:val="0"/>
+          <w:sz w:val="24"/>
+          <w:lang w:val="id-ID" w:eastAsia="id-ID"/>
+          <w14:ligatures w14:val="none"/>
+        </w:rPr>
+        <w:t>Anra:</w:t>
+      </w:r>
+      <w:r>
+        <w:rPr>
+          <w:rFonts w:ascii="Times New Roman" w:eastAsia="Times New Roman" w:hAnsi="Times New Roman" w:cs="Times New Roman"/>
+          <w:color w:val="000000" w:themeColor="text1"/>
+          <w:kern w:val="0"/>
+          <w:sz w:val="24"/>
+          <w:lang w:val="id-ID" w:eastAsia="id-ID"/>
+          <w14:ligatures w14:val="none"/>
+        </w:rPr>
+        <w:t xml:space="preserve"> Iya, jujur ini masalah yang saya alami dari dulu. Tugas dari dosen itu kadang dikasih lewat grup WhatsApp, kadang lewat e-learning, kadang cuma diomongin sekilas di kelas. Saya sering kelewatan info, atau kalaupun inget tugasnya, saya lupa deadline-nya kapan. Akhirnya ada aja tugas yang telat saya kumpulin.</w:t>
+      </w:r>
+    </w:p>
+    <w:p>
+      <w:pPr>
+        <w:spacing w:before="100" w:beforeAutospacing="1" w:after="100" w:afterAutospacing="1" w:line="240" w:lineRule="auto"/>
+        <w:rPr>
+          <w:rFonts w:ascii="Times New Roman" w:eastAsia="Times New Roman" w:hAnsi="Times New Roman" w:cs="Times New Roman"/>
+          <w:color w:val="000000" w:themeColor="text1"/>
+          <w:kern w:val="0"/>
+          <w:sz w:val="24"/>
+          <w:lang w:val="id-ID" w:eastAsia="id-ID"/>
+          <w14:ligatures w14:val="none"/>
+        </w:rPr>
+      </w:pPr>
+      <w:r>
+        <w:rPr>
+          <w:rFonts w:ascii="Times New Roman" w:eastAsia="Times New Roman" w:hAnsi="Times New Roman" w:cs="Times New Roman"/>
+          <w:b/>
+          <w:bCs/>
+          <w:color w:val="000000" w:themeColor="text1"/>
+          <w:kern w:val="0"/>
+          <w:sz w:val="24"/>
+          <w:lang w:val="id-ID" w:eastAsia="id-ID"/>
+          <w14:ligatures w14:val="none"/>
+        </w:rPr>
+        <w:t>Rasha:</w:t>
+      </w:r>
+      <w:r>
+        <w:rPr>
+          <w:rFonts w:ascii="Times New Roman" w:eastAsia="Times New Roman" w:hAnsi="Times New Roman" w:cs="Times New Roman"/>
+          <w:color w:val="000000" w:themeColor="text1"/>
+          <w:kern w:val="0"/>
+          <w:sz w:val="24"/>
+          <w:lang w:val="id-ID" w:eastAsia="id-ID"/>
+          <w14:ligatures w14:val="none"/>
+        </w:rPr>
+        <w:t xml:space="preserve"> Dari masalah itu, saya </w:t>
+      </w:r>
+      <w:r>
+        <w:rPr>
+          <w:rFonts w:ascii="Times New Roman" w:eastAsia="Times New Roman" w:hAnsi="Times New Roman" w:cs="Times New Roman"/>
+          <w:color w:val="000000" w:themeColor="text1"/>
+          <w:kern w:val="0"/>
+          <w:sz w:val="24"/>
+          <w:lang w:val="id-ID" w:eastAsia="id-ID"/>
+          <w14:ligatures w14:val="none"/>
+        </w:rPr>
+        <w:t>izin untuk mengumpulkan hasil wawancara kamu sebagai pondasi untuk akar permasalahan di tugas kita ya...</w:t>
+      </w:r>
+    </w:p>
+    <w:p>
+      <w:pPr>
+        <w:spacing w:before="100" w:beforeAutospacing="1" w:after="100" w:afterAutospacing="1" w:line="240" w:lineRule="auto"/>
+        <w:rPr>
+          <w:rFonts w:ascii="Times New Roman" w:eastAsia="Times New Roman" w:hAnsi="Times New Roman" w:cs="Times New Roman"/>
+          <w:b/>
+          <w:bCs/>
+          <w:color w:val="000000" w:themeColor="text1"/>
+          <w:kern w:val="0"/>
+          <w:sz w:val="24"/>
+          <w:lang w:val="id-ID" w:eastAsia="id-ID"/>
+          <w14:ligatures w14:val="none"/>
+        </w:rPr>
+      </w:pPr>
+      <w:r>
+        <w:rPr>
+          <w:rFonts w:ascii="Times New Roman" w:eastAsia="Times New Roman" w:hAnsi="Times New Roman" w:cs="Times New Roman"/>
+          <w:b/>
+          <w:bCs/>
+          <w:color w:val="000000" w:themeColor="text1"/>
+          <w:kern w:val="0"/>
+          <w:sz w:val="24"/>
+          <w:lang w:val="id-ID" w:eastAsia="id-ID"/>
+          <w14:ligatures w14:val="none"/>
+        </w:rPr>
+        <w:t>Anra:</w:t>
+      </w:r>
+      <w:r>
+        <w:rPr>
+          <w:rFonts w:ascii="Times New Roman" w:eastAsia="Times New Roman" w:hAnsi="Times New Roman" w:cs="Times New Roman"/>
+          <w:b/>
+          <w:bCs/>
+          <w:color w:val="000000" w:themeColor="text1"/>
+          <w:kern w:val="0"/>
+          <w:sz w:val="24"/>
+          <w:lang w:val="id-ID" w:eastAsia="id-ID"/>
+          <w14:ligatures w14:val="none"/>
+        </w:rPr>
+        <w:t xml:space="preserve"> </w:t>
+      </w:r>
+      <w:r>
+        <w:rPr>
+          <w:rFonts w:ascii="Times New Roman" w:eastAsia="Times New Roman" w:hAnsi="Times New Roman" w:cs="Times New Roman"/>
+          <w:color w:val="000000" w:themeColor="text1"/>
+          <w:kern w:val="0"/>
+          <w:sz w:val="24"/>
+          <w:lang w:val="id-ID" w:eastAsia="id-ID"/>
+          <w14:ligatures w14:val="none"/>
+        </w:rPr>
+        <w:t>iya rasha gapapapappa di pakai saja</w:t>
+      </w:r>
+      <w:r>
+        <w:rPr>
+          <w:rFonts w:ascii="Times New Roman" w:eastAsia="Times New Roman" w:hAnsi="Times New Roman" w:cs="Times New Roman"/>
+          <w:b/>
+          <w:bCs/>
+          <w:color w:val="000000" w:themeColor="text1"/>
+          <w:kern w:val="0"/>
+          <w:sz w:val="24"/>
+          <w:lang w:val="id-ID" w:eastAsia="id-ID"/>
+          <w14:ligatures w14:val="none"/>
+        </w:rPr>
+        <w:t>.</w:t>
+      </w:r>
+    </w:p>
+    <w:p>
+      <w:pPr>
+        <w:spacing w:before="100" w:beforeAutospacing="1" w:after="100" w:afterAutospacing="1" w:line="240" w:lineRule="auto"/>
+        <w:rPr>
+          <w:rFonts w:ascii="Times New Roman" w:eastAsia="Times New Roman" w:hAnsi="Times New Roman" w:cs="Times New Roman"/>
+          <w:b/>
+          <w:bCs/>
+          <w:color w:val="000000" w:themeColor="text1"/>
+          <w:kern w:val="0"/>
+          <w:sz w:val="24"/>
+          <w:lang w:val="id-ID" w:eastAsia="id-ID"/>
+          <w14:ligatures w14:val="none"/>
+        </w:rPr>
+      </w:pPr>
+      <w:r>
+        <w:rPr>
+          <w:rFonts w:ascii="Times New Roman" w:eastAsia="Times New Roman" w:hAnsi="Times New Roman" w:cs="Times New Roman"/>
+          <w:b/>
+          <w:bCs/>
+          <w:color w:val="000000" w:themeColor="text1"/>
+          <w:kern w:val="0"/>
+          <w:sz w:val="24"/>
+          <w:lang w:val="id-ID" w:eastAsia="id-ID"/>
+          <w14:ligatures w14:val="none"/>
+        </w:rPr>
+        <w:t>Wawancara dilakukan pada tanggal 14 September 2026.</w:t>
+      </w:r>
+    </w:p>
+    <w:p>
+      <w:pPr>
+        <w:spacing w:before="100" w:beforeAutospacing="1" w:after="100" w:afterAutospacing="1" w:line="240" w:lineRule="auto"/>
+        <w:rPr>
+          <w:rFonts w:ascii="Times New Roman" w:eastAsia="Times New Roman" w:hAnsi="Times New Roman" w:cs="Times New Roman"/>
+          <w:b/>
+          <w:bCs/>
+          <w:color w:val="000000" w:themeColor="text1"/>
+          <w:kern w:val="0"/>
+          <w:sz w:val="24"/>
+          <w:lang w:val="id-ID" w:eastAsia="id-ID"/>
+          <w14:ligatures w14:val="none"/>
+        </w:rPr>
+      </w:pPr>
+    </w:p>
+    <w:p>
+      <w:pPr>
+        <w:spacing w:before="100" w:beforeAutospacing="1" w:after="100" w:afterAutospacing="1" w:line="240" w:lineRule="auto"/>
+        <w:rPr>
+          <w:rFonts w:ascii="Times New Roman" w:eastAsia="Times New Roman" w:hAnsi="Times New Roman" w:cs="Times New Roman"/>
+          <w:color w:val="000000" w:themeColor="text1"/>
+          <w:kern w:val="0"/>
+          <w:sz w:val="24"/>
+          <w:lang w:val="id-ID" w:eastAsia="id-ID"/>
+          <w14:ligatures w14:val="none"/>
+        </w:rPr>
+      </w:pPr>
+      <w:r>
+        <w:rPr>
+          <w:rFonts w:ascii="Times New Roman" w:eastAsia="Times New Roman" w:hAnsi="Times New Roman" w:cs="Times New Roman"/>
+          <w:b/>
+          <w:bCs/>
+          <w:color w:val="000000" w:themeColor="text1"/>
+          <w:kern w:val="0"/>
+          <w:sz w:val="24"/>
+          <w:lang w:val="id-ID" w:eastAsia="id-ID"/>
+          <w14:ligatures w14:val="none"/>
+        </w:rPr>
+        <w:t xml:space="preserve">Jadi,  </w:t>
+      </w:r>
+      <w:r>
+        <w:rPr>
+          <w:rFonts w:ascii="Times New Roman" w:eastAsia="Times New Roman" w:hAnsi="Times New Roman" w:cs="Times New Roman"/>
+          <w:b/>
+          <w:bCs/>
+          <w:color w:val="000000" w:themeColor="text1"/>
+          <w:kern w:val="0"/>
+          <w:sz w:val="24"/>
+          <w:lang w:val="id-ID" w:eastAsia="id-ID"/>
+          <w14:ligatures w14:val="none"/>
+        </w:rPr>
+        <w:t>problem utamanya adalah:</w:t>
+      </w:r>
+    </w:p>
+    <w:p>
+      <w:pPr>
+        <w:spacing w:before="100" w:beforeAutospacing="1" w:after="100" w:afterAutospacing="1" w:line="240" w:lineRule="auto"/>
+        <w:rPr>
+          <w:rFonts w:ascii="Times New Roman" w:eastAsia="Times New Roman" w:hAnsi="Times New Roman" w:cs="Times New Roman"/>
+          <w:color w:val="000000" w:themeColor="text1"/>
+          <w:kern w:val="0"/>
+          <w:sz w:val="24"/>
+          <w:lang w:val="id-ID" w:eastAsia="id-ID"/>
+          <w14:ligatures w14:val="none"/>
+        </w:rPr>
+      </w:pPr>
+      <w:r>
+        <w:rPr>
+          <w:rFonts w:ascii="Times New Roman" w:eastAsia="Times New Roman" w:hAnsi="Times New Roman" w:cs="Times New Roman"/>
+          <w:b/>
+          <w:bCs/>
+          <w:color w:val="000000" w:themeColor="text1"/>
           <w:kern w:val="0"/>
           <w:sz w:val="24"/>
           <w:lang w:val="id-ID" w:eastAsia="id-ID"/>
@@ -556,7 +826,7 @@
       <w:r>
         <w:rPr>
           <w:rFonts w:ascii="Times New Roman" w:eastAsia="Times New Roman" w:hAnsi="Times New Roman" w:cs="Times New Roman"/>
-          <w:color w:val="auto"/>
+          <w:color w:val="000000" w:themeColor="text1"/>
           <w:kern w:val="0"/>
           <w:sz w:val="24"/>
           <w:lang w:val="id-ID" w:eastAsia="id-ID"/>
@@ -574,17 +844,17 @@
         <w:spacing w:before="100" w:beforeAutospacing="1" w:after="100" w:afterAutospacing="1" w:line="240" w:lineRule="auto"/>
         <w:rPr>
           <w:rFonts w:ascii="Times New Roman" w:eastAsia="Times New Roman" w:hAnsi="Times New Roman" w:cs="Times New Roman"/>
-          <w:color w:val="auto"/>
-          <w:kern w:val="0"/>
-          <w:sz w:val="24"/>
-          <w:lang w:val="id-ID" w:eastAsia="id-ID"/>
-          <w14:ligatures w14:val="none"/>
-        </w:rPr>
-      </w:pPr>
-      <w:r>
-        <w:rPr>
-          <w:rFonts w:ascii="Times New Roman" w:eastAsia="Times New Roman" w:hAnsi="Times New Roman" w:cs="Times New Roman"/>
-          <w:color w:val="auto"/>
+          <w:color w:val="000000" w:themeColor="text1"/>
+          <w:kern w:val="0"/>
+          <w:sz w:val="24"/>
+          <w:lang w:val="id-ID" w:eastAsia="id-ID"/>
+          <w14:ligatures w14:val="none"/>
+        </w:rPr>
+      </w:pPr>
+      <w:r>
+        <w:rPr>
+          <w:rFonts w:ascii="Times New Roman" w:eastAsia="Times New Roman" w:hAnsi="Times New Roman" w:cs="Times New Roman"/>
+          <w:color w:val="000000" w:themeColor="text1"/>
           <w:kern w:val="0"/>
           <w:sz w:val="24"/>
           <w:lang w:val="id-ID" w:eastAsia="id-ID"/>
@@ -602,69 +872,23 @@
         <w:spacing w:before="100" w:beforeAutospacing="1" w:after="100" w:afterAutospacing="1" w:line="240" w:lineRule="auto"/>
         <w:rPr>
           <w:rFonts w:ascii="Times New Roman" w:eastAsia="Times New Roman" w:hAnsi="Times New Roman" w:cs="Times New Roman"/>
-          <w:color w:val="auto"/>
-          <w:kern w:val="0"/>
-          <w:sz w:val="24"/>
-          <w:lang w:val="id-ID" w:eastAsia="id-ID"/>
-          <w14:ligatures w14:val="none"/>
-        </w:rPr>
-      </w:pPr>
-      <w:r>
-        <w:rPr>
-          <w:rFonts w:ascii="Times New Roman" w:eastAsia="Times New Roman" w:hAnsi="Times New Roman" w:cs="Times New Roman"/>
-          <w:color w:val="auto"/>
-          <w:kern w:val="0"/>
-          <w:sz w:val="24"/>
-          <w:lang w:val="id-ID" w:eastAsia="id-ID"/>
-          <w14:ligatures w14:val="none"/>
-        </w:rPr>
-        <w:t xml:space="preserve">Ketidakmampuan mengatur prioritas </w:t>
-      </w:r>
-      <w:r>
-        <w:rPr>
-          <w:rFonts w:ascii="Times New Roman" w:eastAsia="Times New Roman" w:hAnsi="Times New Roman" w:cs="Times New Roman"/>
-          <w:color w:val="auto"/>
-          <w:kern w:val="0"/>
-          <w:sz w:val="24"/>
-          <w:lang w:val="id-ID" w:eastAsia="id-ID"/>
-          <w14:ligatures w14:val="none"/>
-        </w:rPr>
-        <w:t xml:space="preserve">-&gt; </w:t>
-      </w:r>
-      <w:r>
-        <w:rPr>
-          <w:rFonts w:ascii="Times New Roman" w:eastAsia="Times New Roman" w:hAnsi="Times New Roman" w:cs="Times New Roman"/>
-          <w:color w:val="auto"/>
-          <w:kern w:val="0"/>
-          <w:sz w:val="24"/>
-          <w:lang w:val="id-ID" w:eastAsia="id-ID"/>
-          <w14:ligatures w14:val="none"/>
-        </w:rPr>
-        <w:t xml:space="preserve">menyebabkan </w:t>
-      </w:r>
-      <w:proofErr w:type="spellStart"/>
-      <w:r>
-        <w:rPr>
-          <w:rFonts w:ascii="Times New Roman" w:eastAsia="Times New Roman" w:hAnsi="Times New Roman" w:cs="Times New Roman"/>
-          <w:color w:val="auto"/>
-          <w:kern w:val="0"/>
-          <w:sz w:val="24"/>
-          <w:lang w:val="id-ID" w:eastAsia="id-ID"/>
-          <w14:ligatures w14:val="none"/>
-        </w:rPr>
-        <w:t>prokrastinasi</w:t>
-      </w:r>
-      <w:proofErr w:type="spellEnd"/>
-      <w:r>
-        <w:rPr>
-          <w:rFonts w:ascii="Times New Roman" w:eastAsia="Times New Roman" w:hAnsi="Times New Roman" w:cs="Times New Roman"/>
-          <w:color w:val="auto"/>
-          <w:kern w:val="0"/>
-          <w:sz w:val="24"/>
-          <w:lang w:val="id-ID" w:eastAsia="id-ID"/>
-          <w14:ligatures w14:val="none"/>
-        </w:rPr>
-        <w:t xml:space="preserve"> dan burnout akademik,</w:t>
+          <w:color w:val="000000" w:themeColor="text1"/>
+          <w:kern w:val="0"/>
+          <w:sz w:val="24"/>
+          <w:lang w:val="id-ID" w:eastAsia="id-ID"/>
+          <w14:ligatures w14:val="none"/>
+        </w:rPr>
+      </w:pPr>
+      <w:r>
+        <w:rPr>
+          <w:rFonts w:ascii="Times New Roman" w:eastAsia="Times New Roman" w:hAnsi="Times New Roman" w:cs="Times New Roman"/>
+          <w:color w:val="000000" w:themeColor="text1"/>
+          <w:kern w:val="0"/>
+          <w:sz w:val="24"/>
+          <w:lang w:val="id-ID" w:eastAsia="id-ID"/>
+          <w14:ligatures w14:val="none"/>
+        </w:rPr>
+        <w:t>Ketidakmampuan mengatur prioritas -&gt; menyebabkan prokrastinasi dan burnout akademik,</w:t>
       </w:r>
     </w:p>
     <w:p>
@@ -676,836 +900,460 @@
         <w:spacing w:before="100" w:beforeAutospacing="1" w:after="100" w:afterAutospacing="1" w:line="240" w:lineRule="auto"/>
         <w:rPr>
           <w:rFonts w:ascii="Times New Roman" w:eastAsia="Times New Roman" w:hAnsi="Times New Roman" w:cs="Times New Roman"/>
-          <w:color w:val="auto"/>
-          <w:kern w:val="0"/>
-          <w:sz w:val="24"/>
-          <w:lang w:val="id-ID" w:eastAsia="id-ID"/>
-          <w14:ligatures w14:val="none"/>
-        </w:rPr>
-      </w:pPr>
-      <w:r>
-        <w:rPr>
-          <w:rFonts w:ascii="Times New Roman" w:eastAsia="Times New Roman" w:hAnsi="Times New Roman" w:cs="Times New Roman"/>
-          <w:color w:val="auto"/>
-          <w:kern w:val="0"/>
-          <w:sz w:val="24"/>
-          <w:lang w:val="id-ID" w:eastAsia="id-ID"/>
-          <w14:ligatures w14:val="none"/>
-        </w:rPr>
-        <w:t xml:space="preserve">Sistem informasi akademik konvensional yang tidak efisien (harus </w:t>
-      </w:r>
-      <w:proofErr w:type="spellStart"/>
-      <w:r>
-        <w:rPr>
-          <w:rFonts w:ascii="Times New Roman" w:eastAsia="Times New Roman" w:hAnsi="Times New Roman" w:cs="Times New Roman"/>
-          <w:color w:val="auto"/>
-          <w:kern w:val="0"/>
-          <w:sz w:val="24"/>
-          <w:lang w:val="id-ID" w:eastAsia="id-ID"/>
-          <w14:ligatures w14:val="none"/>
-        </w:rPr>
-        <w:t>login</w:t>
-      </w:r>
-      <w:proofErr w:type="spellEnd"/>
-      <w:r>
-        <w:rPr>
-          <w:rFonts w:ascii="Times New Roman" w:eastAsia="Times New Roman" w:hAnsi="Times New Roman" w:cs="Times New Roman"/>
-          <w:color w:val="auto"/>
-          <w:kern w:val="0"/>
-          <w:sz w:val="24"/>
-          <w:lang w:val="id-ID" w:eastAsia="id-ID"/>
-          <w14:ligatures w14:val="none"/>
-        </w:rPr>
-        <w:t xml:space="preserve"> manual berulang kali hanya untuk cek jadwal/perubahan kelas), sehingga rawan melewatkan informasi penting secara </w:t>
+          <w:color w:val="000000" w:themeColor="text1"/>
+          <w:kern w:val="0"/>
+          <w:sz w:val="24"/>
+          <w:lang w:val="id-ID" w:eastAsia="id-ID"/>
+          <w14:ligatures w14:val="none"/>
+        </w:rPr>
+      </w:pPr>
+      <w:r>
+        <w:rPr>
+          <w:rFonts w:ascii="Times New Roman" w:eastAsia="Times New Roman" w:hAnsi="Times New Roman" w:cs="Times New Roman"/>
+          <w:color w:val="000000" w:themeColor="text1"/>
+          <w:kern w:val="0"/>
+          <w:sz w:val="24"/>
+          <w:lang w:val="id-ID" w:eastAsia="id-ID"/>
+          <w14:ligatures w14:val="none"/>
+        </w:rPr>
+        <w:t xml:space="preserve">Sistem informasi akademik konvensional yang tidak efisien (harus login manual berulang kali hanya untuk cek jadwal/perubahan kelas), sehingga rawan melewatkan informasi penting secara </w:t>
       </w:r>
       <w:r>
         <w:rPr>
           <w:rFonts w:ascii="Times New Roman" w:eastAsia="Times New Roman" w:hAnsi="Times New Roman" w:cs="Times New Roman"/>
           <w:i/>
           <w:iCs/>
-          <w:color w:val="auto"/>
-          <w:kern w:val="0"/>
-          <w:sz w:val="24"/>
-          <w:lang w:val="id-ID" w:eastAsia="id-ID"/>
-          <w14:ligatures w14:val="none"/>
-        </w:rPr>
-        <w:t>real-</w:t>
-      </w:r>
-      <w:proofErr w:type="spellStart"/>
-      <w:r>
-        <w:rPr>
-          <w:rFonts w:ascii="Times New Roman" w:eastAsia="Times New Roman" w:hAnsi="Times New Roman" w:cs="Times New Roman"/>
+          <w:color w:val="000000" w:themeColor="text1"/>
+          <w:kern w:val="0"/>
+          <w:sz w:val="24"/>
+          <w:lang w:val="id-ID" w:eastAsia="id-ID"/>
+          <w14:ligatures w14:val="none"/>
+        </w:rPr>
+        <w:t>real-time</w:t>
+      </w:r>
+      <w:r>
+        <w:rPr>
+          <w:rFonts w:ascii="Times New Roman" w:eastAsia="Times New Roman" w:hAnsi="Times New Roman" w:cs="Times New Roman"/>
+          <w:color w:val="000000" w:themeColor="text1"/>
+          <w:kern w:val="0"/>
+          <w:sz w:val="24"/>
+          <w:lang w:val="id-ID" w:eastAsia="id-ID"/>
+          <w14:ligatures w14:val="none"/>
+        </w:rPr>
+        <w:t>.</w:t>
+      </w:r>
+    </w:p>
+    <w:p>
+      <w:pPr>
+        <w:rPr>
+          <w:rFonts w:ascii="Times New Roman" w:hAnsi="Times New Roman" w:cs="Times New Roman"/>
+          <w:color w:val="000000" w:themeColor="text1"/>
+        </w:rPr>
+      </w:pPr>
+      <w:r>
+        <w:rPr>
+          <w:rFonts w:ascii="Times New Roman" w:hAnsi="Times New Roman" w:cs="Times New Roman"/>
+          <w:color w:val="000000" w:themeColor="text1"/>
+        </w:rPr>
+        <w:t xml:space="preserve">jadi intinya kami memilih DigiPlan ini karena kami melihat sendiri bagaimana susahnya mahasiswa untuk menghafal tugas tugas mereka di karenakan banyaknya sks ataupun kegiatan non akademik, jadi kami berangkat dari masalah , yaitu yang ingin diselesaikan DigiPlan adalah: </w:t>
+      </w:r>
+      <w:r>
+        <w:rPr>
+          <w:rStyle w:val="Kuat"/>
+          <w:rFonts w:ascii="Times New Roman" w:hAnsi="Times New Roman" w:cs="Times New Roman"/>
+          <w:color w:val="000000" w:themeColor="text1"/>
+        </w:rPr>
+        <w:t>kurangnya sistem pengingat dan manajemen jadwal akademik yang otomatis, praktis, dan real-time</w:t>
+      </w:r>
+      <w:r>
+        <w:rPr>
+          <w:rFonts w:ascii="Times New Roman" w:hAnsi="Times New Roman" w:cs="Times New Roman"/>
+          <w:color w:val="000000" w:themeColor="text1"/>
+        </w:rPr>
+        <w:t>, yang menyebabkan mahasiswa/siswa sering melewatkan tenggat waktu tugas dan kesulitan mengatur prioritas belajar.</w:t>
+      </w:r>
+    </w:p>
+    <w:p>
+      <w:pPr>
+        <w:rPr>
+          <w:rFonts w:ascii="Times New Roman" w:hAnsi="Times New Roman" w:cs="Times New Roman"/>
+          <w:color w:val="000000" w:themeColor="text1"/>
+        </w:rPr>
+      </w:pPr>
+    </w:p>
+    <w:p>
+      <w:pPr>
+        <w:spacing w:before="100" w:beforeAutospacing="1" w:after="100" w:afterAutospacing="1" w:line="240" w:lineRule="auto"/>
+        <w:rPr>
+          <w:rFonts w:ascii="Times New Roman" w:eastAsia="Times New Roman" w:hAnsi="Times New Roman" w:cs="Times New Roman"/>
+          <w:color w:val="000000" w:themeColor="text1"/>
+          <w:kern w:val="0"/>
+          <w:sz w:val="24"/>
+          <w:lang w:val="id-ID" w:eastAsia="id-ID"/>
+          <w14:ligatures w14:val="none"/>
+        </w:rPr>
+      </w:pPr>
+      <w:r>
+        <w:rPr>
+          <w:rFonts w:ascii="Times New Roman" w:eastAsia="Times New Roman" w:hAnsi="Times New Roman" w:cs="Times New Roman"/>
+          <w:color w:val="000000" w:themeColor="text1"/>
+          <w:kern w:val="0"/>
+          <w:sz w:val="24"/>
+          <w:lang w:val="id-ID" w:eastAsia="id-ID"/>
+          <w14:ligatures w14:val="none"/>
+        </w:rPr>
+        <w:lastRenderedPageBreak/>
+        <w:t>Setelah dari situ kami mendapatkan rumusan masalahnya dan tujuan nya :</w:t>
+      </w:r>
+    </w:p>
+    <w:p>
+      <w:pPr>
+        <w:pStyle w:val="Judul2"/>
+        <w:jc w:val="both"/>
+        <w:rPr>
+          <w:rFonts w:ascii="Times New Roman" w:hAnsi="Times New Roman" w:cs="Times New Roman"/>
+          <w:color w:val="000000" w:themeColor="text1"/>
+        </w:rPr>
+      </w:pPr>
+      <w:r>
+        <w:rPr>
+          <w:rFonts w:ascii="Times New Roman" w:hAnsi="Times New Roman" w:cs="Times New Roman"/>
+          <w:color w:val="000000" w:themeColor="text1"/>
+        </w:rPr>
+        <w:t>Rumusan Masalah</w:t>
+      </w:r>
+    </w:p>
+    <w:p>
+      <w:pPr>
+        <w:numPr>
+          <w:ilvl w:val="0"/>
+          <w:numId w:val="3"/>
+        </w:numPr>
+        <w:spacing w:after="0" w:line="360" w:lineRule="auto"/>
+        <w:jc w:val="both"/>
+        <w:rPr>
+          <w:rFonts w:ascii="Times New Roman" w:hAnsi="Times New Roman" w:cs="Times New Roman"/>
+          <w:color w:val="000000" w:themeColor="text1"/>
+        </w:rPr>
+      </w:pPr>
+      <w:r>
+        <w:rPr>
+          <w:rFonts w:ascii="Times New Roman" w:hAnsi="Times New Roman" w:cs="Times New Roman"/>
+          <w:color w:val="000000" w:themeColor="text1"/>
+        </w:rPr>
+        <w:t xml:space="preserve">Bagaimana merancang fitur integrasi otomatis untuk mengekstraksi data akademik dari LMS agar pengguna tidak perlu melakukan </w:t>
+      </w:r>
+      <w:r>
+        <w:rPr>
+          <w:rFonts w:ascii="Times New Roman" w:hAnsi="Times New Roman" w:cs="Times New Roman"/>
           <w:i/>
           <w:iCs/>
-          <w:color w:val="auto"/>
-          <w:kern w:val="0"/>
-          <w:sz w:val="24"/>
-          <w:lang w:val="id-ID" w:eastAsia="id-ID"/>
-          <w14:ligatures w14:val="none"/>
-        </w:rPr>
-        <w:t>time</w:t>
-      </w:r>
-      <w:proofErr w:type="spellEnd"/>
-      <w:r>
-        <w:rPr>
-          <w:rFonts w:ascii="Times New Roman" w:eastAsia="Times New Roman" w:hAnsi="Times New Roman" w:cs="Times New Roman"/>
-          <w:color w:val="auto"/>
-          <w:kern w:val="0"/>
-          <w:sz w:val="24"/>
-          <w:lang w:val="id-ID" w:eastAsia="id-ID"/>
-          <w14:ligatures w14:val="none"/>
+          <w:color w:val="000000" w:themeColor="text1"/>
+        </w:rPr>
+        <w:t xml:space="preserve">input </w:t>
+      </w:r>
+      <w:r>
+        <w:rPr>
+          <w:rFonts w:ascii="Times New Roman" w:hAnsi="Times New Roman" w:cs="Times New Roman"/>
+          <w:color w:val="000000" w:themeColor="text1"/>
+        </w:rPr>
+        <w:t>jadwal secara manual?</w:t>
+      </w:r>
+    </w:p>
+    <w:p>
+      <w:pPr>
+        <w:numPr>
+          <w:ilvl w:val="0"/>
+          <w:numId w:val="3"/>
+        </w:numPr>
+        <w:spacing w:after="0" w:line="360" w:lineRule="auto"/>
+        <w:jc w:val="both"/>
+        <w:rPr>
+          <w:rFonts w:ascii="Times New Roman" w:hAnsi="Times New Roman" w:cs="Times New Roman"/>
+          <w:color w:val="000000" w:themeColor="text1"/>
+        </w:rPr>
+      </w:pPr>
+      <w:r>
+        <w:rPr>
+          <w:rFonts w:ascii="Times New Roman" w:hAnsi="Times New Roman" w:cs="Times New Roman"/>
+          <w:color w:val="000000" w:themeColor="text1"/>
+        </w:rPr>
+        <w:t xml:space="preserve">Bagaimana mengimplementasikan algoritma </w:t>
+      </w:r>
+      <w:r>
+        <w:rPr>
+          <w:rFonts w:ascii="Times New Roman" w:hAnsi="Times New Roman" w:cs="Times New Roman"/>
+          <w:i/>
+          <w:iCs/>
+          <w:color w:val="000000" w:themeColor="text1"/>
+        </w:rPr>
+        <w:t xml:space="preserve">Smart Scheduling </w:t>
+      </w:r>
+      <w:r>
+        <w:rPr>
+          <w:rFonts w:ascii="Times New Roman" w:hAnsi="Times New Roman" w:cs="Times New Roman"/>
+          <w:color w:val="000000" w:themeColor="text1"/>
+        </w:rPr>
+        <w:t>guna menyusun jadwal harian yang optimal berdasarkan bobot dan tenggat waktu tugas?</w:t>
+      </w:r>
+    </w:p>
+    <w:p>
+      <w:pPr>
+        <w:numPr>
+          <w:ilvl w:val="0"/>
+          <w:numId w:val="3"/>
+        </w:numPr>
+        <w:spacing w:after="0" w:line="360" w:lineRule="auto"/>
+        <w:jc w:val="both"/>
+        <w:rPr>
+          <w:rFonts w:ascii="Times New Roman" w:hAnsi="Times New Roman" w:cs="Times New Roman"/>
+          <w:color w:val="000000" w:themeColor="text1"/>
+        </w:rPr>
+      </w:pPr>
+      <w:r>
+        <w:rPr>
+          <w:rFonts w:ascii="Times New Roman" w:hAnsi="Times New Roman" w:cs="Times New Roman"/>
+          <w:color w:val="000000" w:themeColor="text1"/>
+        </w:rPr>
+        <w:t>Bagaimana membangun sistem notifikasi cerdas yang mampu memberikan peringatan sekaligus rekomendasi waktu belajar saat beban tugas akademik menumpuk?</w:t>
+      </w:r>
+    </w:p>
+    <w:p>
+      <w:pPr>
+        <w:numPr>
+          <w:ilvl w:val="0"/>
+          <w:numId w:val="3"/>
+        </w:numPr>
+        <w:spacing w:after="0" w:line="360" w:lineRule="auto"/>
+        <w:jc w:val="both"/>
+        <w:rPr>
+          <w:rFonts w:ascii="Times New Roman" w:hAnsi="Times New Roman" w:cs="Times New Roman"/>
+          <w:color w:val="000000" w:themeColor="text1"/>
+        </w:rPr>
+      </w:pPr>
+      <w:r>
+        <w:rPr>
+          <w:rFonts w:ascii="Times New Roman" w:hAnsi="Times New Roman" w:cs="Times New Roman"/>
+          <w:color w:val="000000" w:themeColor="text1"/>
+        </w:rPr>
+        <w:t>Bagaimana mendesain antarmuka pengguna (UI/UX) yang adaptif untuk menyesuaikan tampilan metrik nilai secara otomatis sesuai profil dan jenjang pendidikan pengguna?</w:t>
+      </w:r>
+    </w:p>
+    <w:p>
+      <w:pPr>
+        <w:pStyle w:val="Judul2"/>
+        <w:jc w:val="both"/>
+        <w:rPr>
+          <w:rFonts w:ascii="Times New Roman" w:hAnsi="Times New Roman" w:cs="Times New Roman"/>
+          <w:color w:val="000000" w:themeColor="text1"/>
+        </w:rPr>
+      </w:pPr>
+      <w:bookmarkStart w:id="0" w:name="_hpnog1ic69a9" w:colFirst="0" w:colLast="0"/>
+      <w:bookmarkEnd w:id="0"/>
+      <w:r>
+        <w:rPr>
+          <w:rFonts w:ascii="Times New Roman" w:hAnsi="Times New Roman" w:cs="Times New Roman"/>
+          <w:color w:val="000000" w:themeColor="text1"/>
+        </w:rPr>
+        <w:t>Tujuan</w:t>
+      </w:r>
+    </w:p>
+    <w:p>
+      <w:pPr>
+        <w:widowControl w:val="0"/>
+        <w:numPr>
+          <w:ilvl w:val="0"/>
+          <w:numId w:val="2"/>
+        </w:numPr>
+        <w:spacing w:after="0" w:line="360" w:lineRule="auto"/>
+        <w:jc w:val="both"/>
+        <w:rPr>
+          <w:rFonts w:ascii="Times New Roman" w:hAnsi="Times New Roman" w:cs="Times New Roman"/>
+          <w:color w:val="000000" w:themeColor="text1"/>
+        </w:rPr>
+      </w:pPr>
+      <w:r>
+        <w:rPr>
+          <w:rFonts w:ascii="Times New Roman" w:hAnsi="Times New Roman" w:cs="Times New Roman"/>
+          <w:b/>
+          <w:bCs/>
+          <w:color w:val="000000" w:themeColor="text1"/>
+        </w:rPr>
+        <w:t>Sinkronisasi Data Akademik Terpusat:</w:t>
+      </w:r>
+      <w:r>
+        <w:rPr>
+          <w:rFonts w:ascii="Times New Roman" w:hAnsi="Times New Roman" w:cs="Times New Roman"/>
+          <w:color w:val="000000" w:themeColor="text1"/>
+        </w:rPr>
+        <w:t xml:space="preserve"> Menarik data silabus, jadwal, dan tenggat waktu tugas.</w:t>
+      </w:r>
+    </w:p>
+    <w:p>
+      <w:pPr>
+        <w:widowControl w:val="0"/>
+        <w:numPr>
+          <w:ilvl w:val="0"/>
+          <w:numId w:val="2"/>
+        </w:numPr>
+        <w:spacing w:after="0" w:line="360" w:lineRule="auto"/>
+        <w:jc w:val="both"/>
+        <w:rPr>
+          <w:rFonts w:ascii="Times New Roman" w:hAnsi="Times New Roman" w:cs="Times New Roman"/>
+          <w:color w:val="000000" w:themeColor="text1"/>
+        </w:rPr>
+      </w:pPr>
+      <w:r>
+        <w:rPr>
+          <w:rFonts w:ascii="Times New Roman" w:hAnsi="Times New Roman" w:cs="Times New Roman"/>
+          <w:b/>
+          <w:bCs/>
+          <w:color w:val="000000" w:themeColor="text1"/>
+        </w:rPr>
+        <w:t>Manajemen Prioritas Berbasis Algoritma (</w:t>
+      </w:r>
+      <w:r>
+        <w:rPr>
+          <w:rFonts w:ascii="Times New Roman" w:hAnsi="Times New Roman" w:cs="Times New Roman"/>
+          <w:b/>
+          <w:bCs/>
+          <w:i/>
+          <w:iCs/>
+          <w:color w:val="000000" w:themeColor="text1"/>
+        </w:rPr>
+        <w:t>Smart Scheduling</w:t>
+      </w:r>
+      <w:r>
+        <w:rPr>
+          <w:rFonts w:ascii="Times New Roman" w:hAnsi="Times New Roman" w:cs="Times New Roman"/>
+          <w:b/>
+          <w:bCs/>
+          <w:color w:val="000000" w:themeColor="text1"/>
+        </w:rPr>
+        <w:t xml:space="preserve">): </w:t>
+      </w:r>
+      <w:r>
+        <w:rPr>
+          <w:rFonts w:ascii="Times New Roman" w:hAnsi="Times New Roman" w:cs="Times New Roman"/>
+          <w:color w:val="000000" w:themeColor="text1"/>
+        </w:rPr>
+        <w:t>Menyusun jadwal harian secara otomatis dengan memecah tugas besar menjadi target kecil berdasarkan bobot dan sisa waktu pengerjaan.</w:t>
+      </w:r>
+    </w:p>
+    <w:p>
+      <w:pPr>
+        <w:widowControl w:val="0"/>
+        <w:numPr>
+          <w:ilvl w:val="0"/>
+          <w:numId w:val="2"/>
+        </w:numPr>
+        <w:spacing w:after="0" w:line="360" w:lineRule="auto"/>
+        <w:jc w:val="both"/>
+        <w:rPr>
+          <w:rFonts w:ascii="Times New Roman" w:hAnsi="Times New Roman" w:cs="Times New Roman"/>
+          <w:color w:val="000000" w:themeColor="text1"/>
+        </w:rPr>
+      </w:pPr>
+      <w:r>
+        <w:rPr>
+          <w:rFonts w:ascii="Times New Roman" w:hAnsi="Times New Roman" w:cs="Times New Roman"/>
+          <w:b/>
+          <w:bCs/>
+          <w:color w:val="000000" w:themeColor="text1"/>
+        </w:rPr>
+        <w:t>Sistem Notifikasi Proaktif:</w:t>
+      </w:r>
+      <w:r>
+        <w:rPr>
+          <w:rFonts w:ascii="Times New Roman" w:hAnsi="Times New Roman" w:cs="Times New Roman"/>
+          <w:color w:val="000000" w:themeColor="text1"/>
+        </w:rPr>
+        <w:t xml:space="preserve"> Memberikan alarm pengingat tenggat waktu sekaligus memberikan rekomendasi alokasi jam belajar tambahan saat tugas sedang menumpuk.</w:t>
+      </w:r>
+    </w:p>
+    <w:p>
+      <w:pPr>
+        <w:widowControl w:val="0"/>
+        <w:numPr>
+          <w:ilvl w:val="0"/>
+          <w:numId w:val="2"/>
+        </w:numPr>
+        <w:spacing w:after="0" w:line="360" w:lineRule="auto"/>
+        <w:jc w:val="both"/>
+        <w:rPr>
+          <w:rFonts w:ascii="Times New Roman" w:hAnsi="Times New Roman" w:cs="Times New Roman"/>
+          <w:color w:val="000000" w:themeColor="text1"/>
+        </w:rPr>
+      </w:pPr>
+      <w:r>
+        <w:rPr>
+          <w:rFonts w:ascii="Times New Roman" w:hAnsi="Times New Roman" w:cs="Times New Roman"/>
+          <w:b/>
+          <w:bCs/>
+          <w:color w:val="000000" w:themeColor="text1"/>
+        </w:rPr>
+        <w:t>Antarmuka Adaptif dan Kolaboratif:</w:t>
+      </w:r>
+      <w:r>
+        <w:rPr>
+          <w:rFonts w:ascii="Times New Roman" w:hAnsi="Times New Roman" w:cs="Times New Roman"/>
+          <w:color w:val="000000" w:themeColor="text1"/>
+        </w:rPr>
+        <w:t xml:space="preserve"> Menyediakan </w:t>
+      </w:r>
+      <w:r>
+        <w:rPr>
+          <w:rFonts w:ascii="Times New Roman" w:hAnsi="Times New Roman" w:cs="Times New Roman"/>
+          <w:i/>
+          <w:iCs/>
+          <w:color w:val="000000" w:themeColor="text1"/>
+        </w:rPr>
+        <w:t xml:space="preserve">dashboard </w:t>
+      </w:r>
+      <w:r>
+        <w:rPr>
+          <w:rFonts w:ascii="Times New Roman" w:hAnsi="Times New Roman" w:cs="Times New Roman"/>
+          <w:color w:val="000000" w:themeColor="text1"/>
+        </w:rPr>
+        <w:t xml:space="preserve">visual yang menyesuaikan jenjang pendidikan pengguna, serta memfasilitasi pendelegasian dan pelacakan progres tugas kelompok secara </w:t>
+      </w:r>
+      <w:r>
+        <w:rPr>
+          <w:rFonts w:ascii="Times New Roman" w:hAnsi="Times New Roman" w:cs="Times New Roman"/>
+          <w:i/>
+          <w:iCs/>
+          <w:color w:val="000000" w:themeColor="text1"/>
+        </w:rPr>
+        <w:t>real-time</w:t>
+      </w:r>
+      <w:r>
+        <w:rPr>
+          <w:rFonts w:ascii="Times New Roman" w:hAnsi="Times New Roman" w:cs="Times New Roman"/>
+          <w:color w:val="000000" w:themeColor="text1"/>
         </w:rPr>
         <w:t>.</w:t>
       </w:r>
     </w:p>
     <w:p>
       <w:pPr>
-        <w:rPr>
-          <w:rFonts w:ascii="Times New Roman" w:hAnsi="Times New Roman" w:cs="Times New Roman"/>
-        </w:rPr>
-      </w:pPr>
-      <w:proofErr w:type="spellStart"/>
-      <w:r>
-        <w:rPr>
-          <w:rFonts w:ascii="Times New Roman" w:hAnsi="Times New Roman" w:cs="Times New Roman"/>
-        </w:rPr>
-        <w:t>jadi</w:t>
-      </w:r>
-      <w:proofErr w:type="spellEnd"/>
-      <w:r>
-        <w:rPr>
-          <w:rFonts w:ascii="Times New Roman" w:hAnsi="Times New Roman" w:cs="Times New Roman"/>
-        </w:rPr>
-        <w:t xml:space="preserve"> </w:t>
-      </w:r>
-      <w:proofErr w:type="spellStart"/>
-      <w:r>
-        <w:rPr>
-          <w:rFonts w:ascii="Times New Roman" w:hAnsi="Times New Roman" w:cs="Times New Roman"/>
-        </w:rPr>
-        <w:t>intinya</w:t>
-      </w:r>
-      <w:proofErr w:type="spellEnd"/>
-      <w:r>
-        <w:rPr>
-          <w:rFonts w:ascii="Times New Roman" w:hAnsi="Times New Roman" w:cs="Times New Roman"/>
-        </w:rPr>
-        <w:t xml:space="preserve"> kami </w:t>
-      </w:r>
-      <w:proofErr w:type="spellStart"/>
-      <w:r>
-        <w:rPr>
-          <w:rFonts w:ascii="Times New Roman" w:hAnsi="Times New Roman" w:cs="Times New Roman"/>
-        </w:rPr>
-        <w:t>memilih</w:t>
-      </w:r>
-      <w:proofErr w:type="spellEnd"/>
-      <w:r>
-        <w:rPr>
-          <w:rFonts w:ascii="Times New Roman" w:hAnsi="Times New Roman" w:cs="Times New Roman"/>
-        </w:rPr>
-        <w:t xml:space="preserve"> </w:t>
-      </w:r>
-      <w:proofErr w:type="spellStart"/>
-      <w:r>
-        <w:rPr>
-          <w:rFonts w:ascii="Times New Roman" w:hAnsi="Times New Roman" w:cs="Times New Roman"/>
-        </w:rPr>
-        <w:t>DigiPlan</w:t>
-      </w:r>
-      <w:proofErr w:type="spellEnd"/>
-      <w:r>
-        <w:rPr>
-          <w:rFonts w:ascii="Times New Roman" w:hAnsi="Times New Roman" w:cs="Times New Roman"/>
-        </w:rPr>
-        <w:t xml:space="preserve"> </w:t>
-      </w:r>
-      <w:proofErr w:type="spellStart"/>
-      <w:r>
-        <w:rPr>
-          <w:rFonts w:ascii="Times New Roman" w:hAnsi="Times New Roman" w:cs="Times New Roman"/>
-        </w:rPr>
-        <w:t>ini</w:t>
-      </w:r>
-      <w:proofErr w:type="spellEnd"/>
-      <w:r>
-        <w:rPr>
-          <w:rFonts w:ascii="Times New Roman" w:hAnsi="Times New Roman" w:cs="Times New Roman"/>
-        </w:rPr>
-        <w:t xml:space="preserve"> </w:t>
-      </w:r>
-      <w:proofErr w:type="spellStart"/>
-      <w:r>
-        <w:rPr>
-          <w:rFonts w:ascii="Times New Roman" w:hAnsi="Times New Roman" w:cs="Times New Roman"/>
-        </w:rPr>
-        <w:t>karena</w:t>
-      </w:r>
-      <w:proofErr w:type="spellEnd"/>
-      <w:r>
-        <w:rPr>
-          <w:rFonts w:ascii="Times New Roman" w:hAnsi="Times New Roman" w:cs="Times New Roman"/>
-        </w:rPr>
-        <w:t xml:space="preserve"> kami </w:t>
-      </w:r>
-      <w:proofErr w:type="spellStart"/>
-      <w:r>
-        <w:rPr>
-          <w:rFonts w:ascii="Times New Roman" w:hAnsi="Times New Roman" w:cs="Times New Roman"/>
-        </w:rPr>
-        <w:t>melihat</w:t>
-      </w:r>
-      <w:proofErr w:type="spellEnd"/>
-      <w:r>
-        <w:rPr>
-          <w:rFonts w:ascii="Times New Roman" w:hAnsi="Times New Roman" w:cs="Times New Roman"/>
-        </w:rPr>
-        <w:t xml:space="preserve"> </w:t>
-      </w:r>
-      <w:proofErr w:type="spellStart"/>
-      <w:r>
-        <w:rPr>
-          <w:rFonts w:ascii="Times New Roman" w:hAnsi="Times New Roman" w:cs="Times New Roman"/>
-        </w:rPr>
-        <w:t>sendiri</w:t>
-      </w:r>
-      <w:proofErr w:type="spellEnd"/>
-      <w:r>
-        <w:rPr>
-          <w:rFonts w:ascii="Times New Roman" w:hAnsi="Times New Roman" w:cs="Times New Roman"/>
-        </w:rPr>
-        <w:t xml:space="preserve"> </w:t>
-      </w:r>
-      <w:proofErr w:type="spellStart"/>
-      <w:r>
-        <w:rPr>
-          <w:rFonts w:ascii="Times New Roman" w:hAnsi="Times New Roman" w:cs="Times New Roman"/>
-        </w:rPr>
-        <w:t>bagaimana</w:t>
-      </w:r>
-      <w:proofErr w:type="spellEnd"/>
-      <w:r>
-        <w:rPr>
-          <w:rFonts w:ascii="Times New Roman" w:hAnsi="Times New Roman" w:cs="Times New Roman"/>
-        </w:rPr>
-        <w:t xml:space="preserve"> </w:t>
-      </w:r>
-      <w:proofErr w:type="spellStart"/>
-      <w:r>
-        <w:rPr>
-          <w:rFonts w:ascii="Times New Roman" w:hAnsi="Times New Roman" w:cs="Times New Roman"/>
-        </w:rPr>
-        <w:t>susahnya</w:t>
-      </w:r>
-      <w:proofErr w:type="spellEnd"/>
-      <w:r>
-        <w:rPr>
-          <w:rFonts w:ascii="Times New Roman" w:hAnsi="Times New Roman" w:cs="Times New Roman"/>
-        </w:rPr>
-        <w:t xml:space="preserve"> </w:t>
-      </w:r>
-      <w:proofErr w:type="spellStart"/>
-      <w:r>
-        <w:rPr>
-          <w:rFonts w:ascii="Times New Roman" w:hAnsi="Times New Roman" w:cs="Times New Roman"/>
-        </w:rPr>
-        <w:t>mahasiswa</w:t>
-      </w:r>
-      <w:proofErr w:type="spellEnd"/>
-      <w:r>
-        <w:rPr>
-          <w:rFonts w:ascii="Times New Roman" w:hAnsi="Times New Roman" w:cs="Times New Roman"/>
-        </w:rPr>
-        <w:t xml:space="preserve"> </w:t>
-      </w:r>
-      <w:proofErr w:type="spellStart"/>
-      <w:r>
-        <w:rPr>
-          <w:rFonts w:ascii="Times New Roman" w:hAnsi="Times New Roman" w:cs="Times New Roman"/>
-        </w:rPr>
-        <w:t>untuk</w:t>
-      </w:r>
-      <w:proofErr w:type="spellEnd"/>
-      <w:r>
-        <w:rPr>
-          <w:rFonts w:ascii="Times New Roman" w:hAnsi="Times New Roman" w:cs="Times New Roman"/>
-        </w:rPr>
-        <w:t xml:space="preserve"> </w:t>
-      </w:r>
-      <w:proofErr w:type="spellStart"/>
-      <w:r>
-        <w:rPr>
-          <w:rFonts w:ascii="Times New Roman" w:hAnsi="Times New Roman" w:cs="Times New Roman"/>
-        </w:rPr>
-        <w:t>menghafal</w:t>
-      </w:r>
-      <w:proofErr w:type="spellEnd"/>
-      <w:r>
-        <w:rPr>
-          <w:rFonts w:ascii="Times New Roman" w:hAnsi="Times New Roman" w:cs="Times New Roman"/>
-        </w:rPr>
-        <w:t xml:space="preserve"> </w:t>
-      </w:r>
-      <w:proofErr w:type="spellStart"/>
-      <w:r>
-        <w:rPr>
-          <w:rFonts w:ascii="Times New Roman" w:hAnsi="Times New Roman" w:cs="Times New Roman"/>
-        </w:rPr>
-        <w:t>tugas</w:t>
-      </w:r>
-      <w:proofErr w:type="spellEnd"/>
-      <w:r>
-        <w:rPr>
-          <w:rFonts w:ascii="Times New Roman" w:hAnsi="Times New Roman" w:cs="Times New Roman"/>
-        </w:rPr>
-        <w:t xml:space="preserve"> </w:t>
-      </w:r>
-      <w:proofErr w:type="spellStart"/>
-      <w:r>
-        <w:rPr>
-          <w:rFonts w:ascii="Times New Roman" w:hAnsi="Times New Roman" w:cs="Times New Roman"/>
-        </w:rPr>
-        <w:t>tugas</w:t>
-      </w:r>
-      <w:proofErr w:type="spellEnd"/>
-      <w:r>
-        <w:rPr>
-          <w:rFonts w:ascii="Times New Roman" w:hAnsi="Times New Roman" w:cs="Times New Roman"/>
-        </w:rPr>
-        <w:t xml:space="preserve"> </w:t>
-      </w:r>
-      <w:proofErr w:type="spellStart"/>
-      <w:r>
-        <w:rPr>
-          <w:rFonts w:ascii="Times New Roman" w:hAnsi="Times New Roman" w:cs="Times New Roman"/>
-        </w:rPr>
-        <w:t>mereka</w:t>
-      </w:r>
-      <w:proofErr w:type="spellEnd"/>
-      <w:r>
-        <w:rPr>
-          <w:rFonts w:ascii="Times New Roman" w:hAnsi="Times New Roman" w:cs="Times New Roman"/>
-        </w:rPr>
-        <w:t xml:space="preserve"> di </w:t>
-      </w:r>
-      <w:proofErr w:type="spellStart"/>
-      <w:r>
-        <w:rPr>
-          <w:rFonts w:ascii="Times New Roman" w:hAnsi="Times New Roman" w:cs="Times New Roman"/>
-        </w:rPr>
-        <w:t>karenakan</w:t>
-      </w:r>
-      <w:proofErr w:type="spellEnd"/>
-      <w:r>
-        <w:rPr>
-          <w:rFonts w:ascii="Times New Roman" w:hAnsi="Times New Roman" w:cs="Times New Roman"/>
-        </w:rPr>
-        <w:t xml:space="preserve"> </w:t>
-      </w:r>
-      <w:proofErr w:type="spellStart"/>
-      <w:r>
-        <w:rPr>
-          <w:rFonts w:ascii="Times New Roman" w:hAnsi="Times New Roman" w:cs="Times New Roman"/>
-        </w:rPr>
-        <w:t>banyaknya</w:t>
-      </w:r>
-      <w:proofErr w:type="spellEnd"/>
-      <w:r>
-        <w:rPr>
-          <w:rFonts w:ascii="Times New Roman" w:hAnsi="Times New Roman" w:cs="Times New Roman"/>
-        </w:rPr>
-        <w:t xml:space="preserve"> </w:t>
-      </w:r>
-      <w:proofErr w:type="spellStart"/>
-      <w:r>
-        <w:rPr>
-          <w:rFonts w:ascii="Times New Roman" w:hAnsi="Times New Roman" w:cs="Times New Roman"/>
-        </w:rPr>
-        <w:t>sks</w:t>
-      </w:r>
-      <w:proofErr w:type="spellEnd"/>
-      <w:r>
-        <w:rPr>
-          <w:rFonts w:ascii="Times New Roman" w:hAnsi="Times New Roman" w:cs="Times New Roman"/>
-        </w:rPr>
-        <w:t xml:space="preserve"> </w:t>
-      </w:r>
-      <w:proofErr w:type="spellStart"/>
-      <w:r>
-        <w:rPr>
-          <w:rFonts w:ascii="Times New Roman" w:hAnsi="Times New Roman" w:cs="Times New Roman"/>
-        </w:rPr>
-        <w:t>ataupun</w:t>
-      </w:r>
-      <w:proofErr w:type="spellEnd"/>
-      <w:r>
-        <w:rPr>
-          <w:rFonts w:ascii="Times New Roman" w:hAnsi="Times New Roman" w:cs="Times New Roman"/>
-        </w:rPr>
-        <w:t xml:space="preserve"> </w:t>
-      </w:r>
-      <w:proofErr w:type="spellStart"/>
-      <w:r>
-        <w:rPr>
-          <w:rFonts w:ascii="Times New Roman" w:hAnsi="Times New Roman" w:cs="Times New Roman"/>
-        </w:rPr>
-        <w:t>kegiatan</w:t>
-      </w:r>
-      <w:proofErr w:type="spellEnd"/>
-      <w:r>
-        <w:rPr>
-          <w:rFonts w:ascii="Times New Roman" w:hAnsi="Times New Roman" w:cs="Times New Roman"/>
-        </w:rPr>
-        <w:t xml:space="preserve"> non </w:t>
-      </w:r>
-      <w:proofErr w:type="spellStart"/>
-      <w:r>
-        <w:rPr>
-          <w:rFonts w:ascii="Times New Roman" w:hAnsi="Times New Roman" w:cs="Times New Roman"/>
-        </w:rPr>
-        <w:t>akademik</w:t>
-      </w:r>
-      <w:proofErr w:type="spellEnd"/>
-      <w:r>
-        <w:rPr>
-          <w:rFonts w:ascii="Times New Roman" w:hAnsi="Times New Roman" w:cs="Times New Roman"/>
-        </w:rPr>
-        <w:t xml:space="preserve">, </w:t>
-      </w:r>
-      <w:proofErr w:type="spellStart"/>
-      <w:r>
-        <w:rPr>
-          <w:rFonts w:ascii="Times New Roman" w:hAnsi="Times New Roman" w:cs="Times New Roman"/>
-        </w:rPr>
-        <w:t>jadi</w:t>
-      </w:r>
-      <w:proofErr w:type="spellEnd"/>
-      <w:r>
-        <w:rPr>
-          <w:rFonts w:ascii="Times New Roman" w:hAnsi="Times New Roman" w:cs="Times New Roman"/>
-        </w:rPr>
-        <w:t xml:space="preserve"> kami </w:t>
-      </w:r>
-      <w:proofErr w:type="spellStart"/>
-      <w:r>
-        <w:rPr>
-          <w:rFonts w:ascii="Times New Roman" w:hAnsi="Times New Roman" w:cs="Times New Roman"/>
-        </w:rPr>
-        <w:t>berangkat</w:t>
-      </w:r>
-      <w:proofErr w:type="spellEnd"/>
-      <w:r>
-        <w:rPr>
-          <w:rFonts w:ascii="Times New Roman" w:hAnsi="Times New Roman" w:cs="Times New Roman"/>
-        </w:rPr>
-        <w:t xml:space="preserve"> </w:t>
-      </w:r>
-      <w:proofErr w:type="spellStart"/>
-      <w:r>
-        <w:rPr>
-          <w:rFonts w:ascii="Times New Roman" w:hAnsi="Times New Roman" w:cs="Times New Roman"/>
-        </w:rPr>
-        <w:t>dari</w:t>
-      </w:r>
-      <w:proofErr w:type="spellEnd"/>
-      <w:r>
-        <w:rPr>
-          <w:rFonts w:ascii="Times New Roman" w:hAnsi="Times New Roman" w:cs="Times New Roman"/>
-        </w:rPr>
-        <w:t xml:space="preserve"> </w:t>
-      </w:r>
-      <w:proofErr w:type="spellStart"/>
-      <w:r>
-        <w:rPr>
-          <w:rFonts w:ascii="Times New Roman" w:hAnsi="Times New Roman" w:cs="Times New Roman"/>
-        </w:rPr>
-        <w:t>masalah</w:t>
-      </w:r>
-      <w:proofErr w:type="spellEnd"/>
-      <w:r>
-        <w:rPr>
-          <w:rFonts w:ascii="Times New Roman" w:hAnsi="Times New Roman" w:cs="Times New Roman"/>
-        </w:rPr>
-        <w:t xml:space="preserve"> , </w:t>
-      </w:r>
-      <w:proofErr w:type="spellStart"/>
-      <w:r>
-        <w:rPr>
-          <w:rFonts w:ascii="Times New Roman" w:hAnsi="Times New Roman" w:cs="Times New Roman"/>
-        </w:rPr>
-        <w:t>yaitu</w:t>
-      </w:r>
-      <w:proofErr w:type="spellEnd"/>
-      <w:r>
-        <w:rPr>
-          <w:rFonts w:ascii="Times New Roman" w:hAnsi="Times New Roman" w:cs="Times New Roman"/>
-        </w:rPr>
-        <w:t xml:space="preserve"> </w:t>
-      </w:r>
-      <w:r>
-        <w:rPr>
-          <w:rFonts w:ascii="Times New Roman" w:hAnsi="Times New Roman" w:cs="Times New Roman"/>
-        </w:rPr>
-        <w:t xml:space="preserve">yang </w:t>
-      </w:r>
-      <w:proofErr w:type="spellStart"/>
-      <w:r>
-        <w:rPr>
-          <w:rFonts w:ascii="Times New Roman" w:hAnsi="Times New Roman" w:cs="Times New Roman"/>
-        </w:rPr>
-        <w:t>ingin</w:t>
-      </w:r>
-      <w:proofErr w:type="spellEnd"/>
-      <w:r>
-        <w:rPr>
-          <w:rFonts w:ascii="Times New Roman" w:hAnsi="Times New Roman" w:cs="Times New Roman"/>
-        </w:rPr>
-        <w:t xml:space="preserve"> </w:t>
-      </w:r>
-      <w:proofErr w:type="spellStart"/>
-      <w:r>
-        <w:rPr>
-          <w:rFonts w:ascii="Times New Roman" w:hAnsi="Times New Roman" w:cs="Times New Roman"/>
-        </w:rPr>
-        <w:t>diselesaikan</w:t>
-      </w:r>
-      <w:proofErr w:type="spellEnd"/>
-      <w:r>
-        <w:rPr>
-          <w:rFonts w:ascii="Times New Roman" w:hAnsi="Times New Roman" w:cs="Times New Roman"/>
-        </w:rPr>
-        <w:t xml:space="preserve"> </w:t>
-      </w:r>
-      <w:proofErr w:type="spellStart"/>
-      <w:r>
-        <w:rPr>
-          <w:rFonts w:ascii="Times New Roman" w:hAnsi="Times New Roman" w:cs="Times New Roman"/>
-        </w:rPr>
-        <w:t>DigiPlan</w:t>
-      </w:r>
-      <w:proofErr w:type="spellEnd"/>
-      <w:r>
-        <w:rPr>
-          <w:rFonts w:ascii="Times New Roman" w:hAnsi="Times New Roman" w:cs="Times New Roman"/>
-        </w:rPr>
-        <w:t xml:space="preserve"> </w:t>
-      </w:r>
-      <w:proofErr w:type="spellStart"/>
-      <w:r>
-        <w:rPr>
-          <w:rFonts w:ascii="Times New Roman" w:hAnsi="Times New Roman" w:cs="Times New Roman"/>
-        </w:rPr>
-        <w:t>adalah</w:t>
-      </w:r>
-      <w:proofErr w:type="spellEnd"/>
-      <w:r>
-        <w:rPr>
-          <w:rFonts w:ascii="Times New Roman" w:hAnsi="Times New Roman" w:cs="Times New Roman"/>
-        </w:rPr>
-        <w:t xml:space="preserve">: </w:t>
-      </w:r>
-      <w:proofErr w:type="spellStart"/>
-      <w:r>
-        <w:rPr>
-          <w:rStyle w:val="Kuat"/>
-          <w:rFonts w:ascii="Times New Roman" w:hAnsi="Times New Roman" w:cs="Times New Roman"/>
-        </w:rPr>
-        <w:t>kurangnya</w:t>
-      </w:r>
-      <w:proofErr w:type="spellEnd"/>
-      <w:r>
-        <w:rPr>
-          <w:rStyle w:val="Kuat"/>
-          <w:rFonts w:ascii="Times New Roman" w:hAnsi="Times New Roman" w:cs="Times New Roman"/>
-        </w:rPr>
-        <w:t xml:space="preserve"> </w:t>
-      </w:r>
-      <w:proofErr w:type="spellStart"/>
-      <w:r>
-        <w:rPr>
-          <w:rStyle w:val="Kuat"/>
-          <w:rFonts w:ascii="Times New Roman" w:hAnsi="Times New Roman" w:cs="Times New Roman"/>
-        </w:rPr>
-        <w:t>sistem</w:t>
-      </w:r>
-      <w:proofErr w:type="spellEnd"/>
-      <w:r>
-        <w:rPr>
-          <w:rStyle w:val="Kuat"/>
-          <w:rFonts w:ascii="Times New Roman" w:hAnsi="Times New Roman" w:cs="Times New Roman"/>
-        </w:rPr>
-        <w:t xml:space="preserve"> </w:t>
-      </w:r>
-      <w:proofErr w:type="spellStart"/>
-      <w:r>
-        <w:rPr>
-          <w:rStyle w:val="Kuat"/>
-          <w:rFonts w:ascii="Times New Roman" w:hAnsi="Times New Roman" w:cs="Times New Roman"/>
-        </w:rPr>
-        <w:t>pengingat</w:t>
-      </w:r>
-      <w:proofErr w:type="spellEnd"/>
-      <w:r>
-        <w:rPr>
-          <w:rStyle w:val="Kuat"/>
-          <w:rFonts w:ascii="Times New Roman" w:hAnsi="Times New Roman" w:cs="Times New Roman"/>
-        </w:rPr>
-        <w:t xml:space="preserve"> dan </w:t>
-      </w:r>
-      <w:proofErr w:type="spellStart"/>
-      <w:r>
-        <w:rPr>
-          <w:rStyle w:val="Kuat"/>
-          <w:rFonts w:ascii="Times New Roman" w:hAnsi="Times New Roman" w:cs="Times New Roman"/>
-        </w:rPr>
-        <w:t>manajemen</w:t>
-      </w:r>
-      <w:proofErr w:type="spellEnd"/>
-      <w:r>
-        <w:rPr>
-          <w:rStyle w:val="Kuat"/>
-          <w:rFonts w:ascii="Times New Roman" w:hAnsi="Times New Roman" w:cs="Times New Roman"/>
-        </w:rPr>
-        <w:t xml:space="preserve"> </w:t>
-      </w:r>
-      <w:proofErr w:type="spellStart"/>
-      <w:r>
-        <w:rPr>
-          <w:rStyle w:val="Kuat"/>
-          <w:rFonts w:ascii="Times New Roman" w:hAnsi="Times New Roman" w:cs="Times New Roman"/>
-        </w:rPr>
-        <w:t>jadwal</w:t>
-      </w:r>
-      <w:proofErr w:type="spellEnd"/>
-      <w:r>
-        <w:rPr>
-          <w:rStyle w:val="Kuat"/>
-          <w:rFonts w:ascii="Times New Roman" w:hAnsi="Times New Roman" w:cs="Times New Roman"/>
-        </w:rPr>
-        <w:t xml:space="preserve"> </w:t>
-      </w:r>
-      <w:proofErr w:type="spellStart"/>
-      <w:r>
-        <w:rPr>
-          <w:rStyle w:val="Kuat"/>
-          <w:rFonts w:ascii="Times New Roman" w:hAnsi="Times New Roman" w:cs="Times New Roman"/>
-        </w:rPr>
-        <w:t>akademik</w:t>
-      </w:r>
-      <w:proofErr w:type="spellEnd"/>
-      <w:r>
-        <w:rPr>
-          <w:rStyle w:val="Kuat"/>
-          <w:rFonts w:ascii="Times New Roman" w:hAnsi="Times New Roman" w:cs="Times New Roman"/>
-        </w:rPr>
-        <w:t xml:space="preserve"> yang </w:t>
-      </w:r>
-      <w:proofErr w:type="spellStart"/>
-      <w:r>
-        <w:rPr>
-          <w:rStyle w:val="Kuat"/>
-          <w:rFonts w:ascii="Times New Roman" w:hAnsi="Times New Roman" w:cs="Times New Roman"/>
-        </w:rPr>
-        <w:t>otomatis</w:t>
-      </w:r>
-      <w:proofErr w:type="spellEnd"/>
-      <w:r>
-        <w:rPr>
-          <w:rStyle w:val="Kuat"/>
-          <w:rFonts w:ascii="Times New Roman" w:hAnsi="Times New Roman" w:cs="Times New Roman"/>
-        </w:rPr>
-        <w:t xml:space="preserve">, </w:t>
-      </w:r>
-      <w:proofErr w:type="spellStart"/>
-      <w:r>
-        <w:rPr>
-          <w:rStyle w:val="Kuat"/>
-          <w:rFonts w:ascii="Times New Roman" w:hAnsi="Times New Roman" w:cs="Times New Roman"/>
-        </w:rPr>
-        <w:t>praktis</w:t>
-      </w:r>
-      <w:proofErr w:type="spellEnd"/>
-      <w:r>
-        <w:rPr>
-          <w:rStyle w:val="Kuat"/>
-          <w:rFonts w:ascii="Times New Roman" w:hAnsi="Times New Roman" w:cs="Times New Roman"/>
-        </w:rPr>
-        <w:t>, dan real-time</w:t>
-      </w:r>
-      <w:r>
-        <w:rPr>
-          <w:rFonts w:ascii="Times New Roman" w:hAnsi="Times New Roman" w:cs="Times New Roman"/>
-        </w:rPr>
-        <w:t xml:space="preserve">, yang </w:t>
-      </w:r>
-      <w:proofErr w:type="spellStart"/>
-      <w:r>
-        <w:rPr>
-          <w:rFonts w:ascii="Times New Roman" w:hAnsi="Times New Roman" w:cs="Times New Roman"/>
-        </w:rPr>
-        <w:t>menyebabkan</w:t>
-      </w:r>
-      <w:proofErr w:type="spellEnd"/>
-      <w:r>
-        <w:rPr>
-          <w:rFonts w:ascii="Times New Roman" w:hAnsi="Times New Roman" w:cs="Times New Roman"/>
-        </w:rPr>
-        <w:t xml:space="preserve"> </w:t>
-      </w:r>
-      <w:proofErr w:type="spellStart"/>
-      <w:r>
-        <w:rPr>
-          <w:rFonts w:ascii="Times New Roman" w:hAnsi="Times New Roman" w:cs="Times New Roman"/>
-        </w:rPr>
-        <w:t>mahasiswa</w:t>
-      </w:r>
-      <w:proofErr w:type="spellEnd"/>
-      <w:r>
-        <w:rPr>
-          <w:rFonts w:ascii="Times New Roman" w:hAnsi="Times New Roman" w:cs="Times New Roman"/>
-        </w:rPr>
-        <w:t>/</w:t>
-      </w:r>
-      <w:proofErr w:type="spellStart"/>
-      <w:r>
-        <w:rPr>
-          <w:rFonts w:ascii="Times New Roman" w:hAnsi="Times New Roman" w:cs="Times New Roman"/>
-        </w:rPr>
-        <w:t>siswa</w:t>
-      </w:r>
-      <w:proofErr w:type="spellEnd"/>
-      <w:r>
-        <w:rPr>
-          <w:rFonts w:ascii="Times New Roman" w:hAnsi="Times New Roman" w:cs="Times New Roman"/>
-        </w:rPr>
-        <w:t xml:space="preserve"> </w:t>
-      </w:r>
-      <w:proofErr w:type="spellStart"/>
-      <w:r>
-        <w:rPr>
-          <w:rFonts w:ascii="Times New Roman" w:hAnsi="Times New Roman" w:cs="Times New Roman"/>
-        </w:rPr>
-        <w:t>sering</w:t>
-      </w:r>
-      <w:proofErr w:type="spellEnd"/>
-      <w:r>
-        <w:rPr>
-          <w:rFonts w:ascii="Times New Roman" w:hAnsi="Times New Roman" w:cs="Times New Roman"/>
-        </w:rPr>
-        <w:t xml:space="preserve"> </w:t>
-      </w:r>
-      <w:proofErr w:type="spellStart"/>
-      <w:r>
-        <w:rPr>
-          <w:rFonts w:ascii="Times New Roman" w:hAnsi="Times New Roman" w:cs="Times New Roman"/>
-        </w:rPr>
-        <w:t>melewatkan</w:t>
-      </w:r>
-      <w:proofErr w:type="spellEnd"/>
-      <w:r>
-        <w:rPr>
-          <w:rFonts w:ascii="Times New Roman" w:hAnsi="Times New Roman" w:cs="Times New Roman"/>
-        </w:rPr>
-        <w:t xml:space="preserve"> </w:t>
-      </w:r>
-      <w:proofErr w:type="spellStart"/>
-      <w:r>
-        <w:rPr>
-          <w:rFonts w:ascii="Times New Roman" w:hAnsi="Times New Roman" w:cs="Times New Roman"/>
-        </w:rPr>
-        <w:t>tenggat</w:t>
-      </w:r>
-      <w:proofErr w:type="spellEnd"/>
-      <w:r>
-        <w:rPr>
-          <w:rFonts w:ascii="Times New Roman" w:hAnsi="Times New Roman" w:cs="Times New Roman"/>
-        </w:rPr>
-        <w:t xml:space="preserve"> </w:t>
-      </w:r>
-      <w:proofErr w:type="spellStart"/>
-      <w:r>
-        <w:rPr>
-          <w:rFonts w:ascii="Times New Roman" w:hAnsi="Times New Roman" w:cs="Times New Roman"/>
-        </w:rPr>
-        <w:t>waktu</w:t>
-      </w:r>
-      <w:proofErr w:type="spellEnd"/>
-      <w:r>
-        <w:rPr>
-          <w:rFonts w:ascii="Times New Roman" w:hAnsi="Times New Roman" w:cs="Times New Roman"/>
-        </w:rPr>
-        <w:t xml:space="preserve"> </w:t>
-      </w:r>
-      <w:proofErr w:type="spellStart"/>
-      <w:r>
-        <w:rPr>
-          <w:rFonts w:ascii="Times New Roman" w:hAnsi="Times New Roman" w:cs="Times New Roman"/>
-        </w:rPr>
-        <w:t>tugas</w:t>
-      </w:r>
-      <w:proofErr w:type="spellEnd"/>
-      <w:r>
-        <w:rPr>
-          <w:rFonts w:ascii="Times New Roman" w:hAnsi="Times New Roman" w:cs="Times New Roman"/>
-        </w:rPr>
-        <w:t xml:space="preserve"> dan </w:t>
-      </w:r>
-      <w:proofErr w:type="spellStart"/>
-      <w:r>
-        <w:rPr>
-          <w:rFonts w:ascii="Times New Roman" w:hAnsi="Times New Roman" w:cs="Times New Roman"/>
-        </w:rPr>
-        <w:t>kesulitan</w:t>
-      </w:r>
-      <w:proofErr w:type="spellEnd"/>
-      <w:r>
-        <w:rPr>
-          <w:rFonts w:ascii="Times New Roman" w:hAnsi="Times New Roman" w:cs="Times New Roman"/>
-        </w:rPr>
-        <w:t xml:space="preserve"> </w:t>
-      </w:r>
-      <w:proofErr w:type="spellStart"/>
-      <w:r>
-        <w:rPr>
-          <w:rFonts w:ascii="Times New Roman" w:hAnsi="Times New Roman" w:cs="Times New Roman"/>
-        </w:rPr>
-        <w:t>mengatur</w:t>
-      </w:r>
-      <w:proofErr w:type="spellEnd"/>
-      <w:r>
-        <w:rPr>
-          <w:rFonts w:ascii="Times New Roman" w:hAnsi="Times New Roman" w:cs="Times New Roman"/>
-        </w:rPr>
-        <w:t xml:space="preserve"> </w:t>
-      </w:r>
-      <w:proofErr w:type="spellStart"/>
-      <w:r>
-        <w:rPr>
-          <w:rFonts w:ascii="Times New Roman" w:hAnsi="Times New Roman" w:cs="Times New Roman"/>
-        </w:rPr>
-        <w:t>prioritas</w:t>
-      </w:r>
-      <w:proofErr w:type="spellEnd"/>
-      <w:r>
-        <w:rPr>
-          <w:rFonts w:ascii="Times New Roman" w:hAnsi="Times New Roman" w:cs="Times New Roman"/>
-        </w:rPr>
-        <w:t xml:space="preserve"> </w:t>
-      </w:r>
-      <w:proofErr w:type="spellStart"/>
-      <w:r>
-        <w:rPr>
-          <w:rFonts w:ascii="Times New Roman" w:hAnsi="Times New Roman" w:cs="Times New Roman"/>
-        </w:rPr>
-        <w:t>belajar</w:t>
-      </w:r>
-      <w:proofErr w:type="spellEnd"/>
-      <w:r>
-        <w:rPr>
-          <w:rFonts w:ascii="Times New Roman" w:hAnsi="Times New Roman" w:cs="Times New Roman"/>
-        </w:rPr>
-        <w:t>.</w:t>
-      </w:r>
+        <w:spacing w:before="100" w:beforeAutospacing="1" w:after="100" w:afterAutospacing="1" w:line="240" w:lineRule="auto"/>
+        <w:rPr>
+          <w:rFonts w:ascii="Times New Roman" w:eastAsia="Times New Roman" w:hAnsi="Times New Roman" w:cs="Times New Roman"/>
+          <w:color w:val="000000" w:themeColor="text1"/>
+          <w:kern w:val="0"/>
+          <w:sz w:val="24"/>
+          <w:lang w:val="id-ID" w:eastAsia="id-ID"/>
+          <w14:ligatures w14:val="none"/>
+        </w:rPr>
+      </w:pPr>
+    </w:p>
+    <w:p>
+      <w:pPr>
+        <w:rPr>
+          <w:rFonts w:ascii="Times New Roman" w:hAnsi="Times New Roman" w:cs="Times New Roman"/>
+          <w:color w:val="000000" w:themeColor="text1"/>
+        </w:rPr>
+      </w:pPr>
     </w:p>
     <w:sectPr>
       <w:pgSz w:w="11906" w:h="16838"/>
@@ -1668,8 +1516,240 @@
       </w:rPr>
     </w:lvl>
   </w:abstractNum>
+  <w:abstractNum w:abstractNumId="1" w15:restartNumberingAfterBreak="0">
+    <w:nsid w:val="46CE0171"/>
+    <w:multiLevelType w:val="multilevel"/>
+    <w:tmpl w:val="EDF4313A"/>
+    <w:lvl w:ilvl="0">
+      <w:start w:val="1"/>
+      <w:numFmt w:val="decimal"/>
+      <w:lvlText w:val="%1."/>
+      <w:lvlJc w:val="left"/>
+      <w:pPr>
+        <w:ind w:left="720" w:hanging="360"/>
+      </w:pPr>
+      <w:rPr>
+        <w:u w:val="none"/>
+      </w:rPr>
+    </w:lvl>
+    <w:lvl w:ilvl="1">
+      <w:start w:val="1"/>
+      <w:numFmt w:val="lowerLetter"/>
+      <w:lvlText w:val="%2."/>
+      <w:lvlJc w:val="left"/>
+      <w:pPr>
+        <w:ind w:left="1440" w:hanging="360"/>
+      </w:pPr>
+      <w:rPr>
+        <w:u w:val="none"/>
+      </w:rPr>
+    </w:lvl>
+    <w:lvl w:ilvl="2">
+      <w:start w:val="1"/>
+      <w:numFmt w:val="lowerRoman"/>
+      <w:lvlText w:val="%3."/>
+      <w:lvlJc w:val="right"/>
+      <w:pPr>
+        <w:ind w:left="2160" w:hanging="360"/>
+      </w:pPr>
+      <w:rPr>
+        <w:u w:val="none"/>
+      </w:rPr>
+    </w:lvl>
+    <w:lvl w:ilvl="3">
+      <w:start w:val="1"/>
+      <w:numFmt w:val="decimal"/>
+      <w:lvlText w:val="%4."/>
+      <w:lvlJc w:val="left"/>
+      <w:pPr>
+        <w:ind w:left="2880" w:hanging="360"/>
+      </w:pPr>
+      <w:rPr>
+        <w:u w:val="none"/>
+      </w:rPr>
+    </w:lvl>
+    <w:lvl w:ilvl="4">
+      <w:start w:val="1"/>
+      <w:numFmt w:val="lowerLetter"/>
+      <w:lvlText w:val="%5."/>
+      <w:lvlJc w:val="left"/>
+      <w:pPr>
+        <w:ind w:left="3600" w:hanging="360"/>
+      </w:pPr>
+      <w:rPr>
+        <w:u w:val="none"/>
+      </w:rPr>
+    </w:lvl>
+    <w:lvl w:ilvl="5">
+      <w:start w:val="1"/>
+      <w:numFmt w:val="lowerRoman"/>
+      <w:lvlText w:val="%6."/>
+      <w:lvlJc w:val="right"/>
+      <w:pPr>
+        <w:ind w:left="4320" w:hanging="360"/>
+      </w:pPr>
+      <w:rPr>
+        <w:u w:val="none"/>
+      </w:rPr>
+    </w:lvl>
+    <w:lvl w:ilvl="6">
+      <w:start w:val="1"/>
+      <w:numFmt w:val="decimal"/>
+      <w:lvlText w:val="%7."/>
+      <w:lvlJc w:val="left"/>
+      <w:pPr>
+        <w:ind w:left="5040" w:hanging="360"/>
+      </w:pPr>
+      <w:rPr>
+        <w:u w:val="none"/>
+      </w:rPr>
+    </w:lvl>
+    <w:lvl w:ilvl="7">
+      <w:start w:val="1"/>
+      <w:numFmt w:val="lowerLetter"/>
+      <w:lvlText w:val="%8."/>
+      <w:lvlJc w:val="left"/>
+      <w:pPr>
+        <w:ind w:left="5760" w:hanging="360"/>
+      </w:pPr>
+      <w:rPr>
+        <w:u w:val="none"/>
+      </w:rPr>
+    </w:lvl>
+    <w:lvl w:ilvl="8">
+      <w:start w:val="1"/>
+      <w:numFmt w:val="lowerRoman"/>
+      <w:lvlText w:val="%9."/>
+      <w:lvlJc w:val="right"/>
+      <w:pPr>
+        <w:ind w:left="6480" w:hanging="360"/>
+      </w:pPr>
+      <w:rPr>
+        <w:u w:val="none"/>
+      </w:rPr>
+    </w:lvl>
+  </w:abstractNum>
+  <w:abstractNum w:abstractNumId="2" w15:restartNumberingAfterBreak="0">
+    <w:nsid w:val="55600F3F"/>
+    <w:multiLevelType w:val="multilevel"/>
+    <w:tmpl w:val="12D0F1C6"/>
+    <w:lvl w:ilvl="0">
+      <w:start w:val="1"/>
+      <w:numFmt w:val="decimal"/>
+      <w:lvlText w:val="%1."/>
+      <w:lvlJc w:val="left"/>
+      <w:pPr>
+        <w:ind w:left="720" w:hanging="360"/>
+      </w:pPr>
+      <w:rPr>
+        <w:u w:val="none"/>
+      </w:rPr>
+    </w:lvl>
+    <w:lvl w:ilvl="1">
+      <w:start w:val="1"/>
+      <w:numFmt w:val="lowerLetter"/>
+      <w:lvlText w:val="%2."/>
+      <w:lvlJc w:val="left"/>
+      <w:pPr>
+        <w:ind w:left="1440" w:hanging="360"/>
+      </w:pPr>
+      <w:rPr>
+        <w:u w:val="none"/>
+      </w:rPr>
+    </w:lvl>
+    <w:lvl w:ilvl="2">
+      <w:start w:val="1"/>
+      <w:numFmt w:val="lowerRoman"/>
+      <w:lvlText w:val="%3."/>
+      <w:lvlJc w:val="right"/>
+      <w:pPr>
+        <w:ind w:left="2160" w:hanging="360"/>
+      </w:pPr>
+      <w:rPr>
+        <w:u w:val="none"/>
+      </w:rPr>
+    </w:lvl>
+    <w:lvl w:ilvl="3">
+      <w:start w:val="1"/>
+      <w:numFmt w:val="decimal"/>
+      <w:lvlText w:val="%4."/>
+      <w:lvlJc w:val="left"/>
+      <w:pPr>
+        <w:ind w:left="2880" w:hanging="360"/>
+      </w:pPr>
+      <w:rPr>
+        <w:u w:val="none"/>
+      </w:rPr>
+    </w:lvl>
+    <w:lvl w:ilvl="4">
+      <w:start w:val="1"/>
+      <w:numFmt w:val="lowerLetter"/>
+      <w:lvlText w:val="%5."/>
+      <w:lvlJc w:val="left"/>
+      <w:pPr>
+        <w:ind w:left="3600" w:hanging="360"/>
+      </w:pPr>
+      <w:rPr>
+        <w:u w:val="none"/>
+      </w:rPr>
+    </w:lvl>
+    <w:lvl w:ilvl="5">
+      <w:start w:val="1"/>
+      <w:numFmt w:val="lowerRoman"/>
+      <w:lvlText w:val="%6."/>
+      <w:lvlJc w:val="right"/>
+      <w:pPr>
+        <w:ind w:left="4320" w:hanging="360"/>
+      </w:pPr>
+      <w:rPr>
+        <w:u w:val="none"/>
+      </w:rPr>
+    </w:lvl>
+    <w:lvl w:ilvl="6">
+      <w:start w:val="1"/>
+      <w:numFmt w:val="decimal"/>
+      <w:lvlText w:val="%7."/>
+      <w:lvlJc w:val="left"/>
+      <w:pPr>
+        <w:ind w:left="5040" w:hanging="360"/>
+      </w:pPr>
+      <w:rPr>
+        <w:u w:val="none"/>
+      </w:rPr>
+    </w:lvl>
+    <w:lvl w:ilvl="7">
+      <w:start w:val="1"/>
+      <w:numFmt w:val="lowerLetter"/>
+      <w:lvlText w:val="%8."/>
+      <w:lvlJc w:val="left"/>
+      <w:pPr>
+        <w:ind w:left="5760" w:hanging="360"/>
+      </w:pPr>
+      <w:rPr>
+        <w:u w:val="none"/>
+      </w:rPr>
+    </w:lvl>
+    <w:lvl w:ilvl="8">
+      <w:start w:val="1"/>
+      <w:numFmt w:val="lowerRoman"/>
+      <w:lvlText w:val="%9."/>
+      <w:lvlJc w:val="right"/>
+      <w:pPr>
+        <w:ind w:left="6480" w:hanging="360"/>
+      </w:pPr>
+      <w:rPr>
+        <w:u w:val="none"/>
+      </w:rPr>
+    </w:lvl>
+  </w:abstractNum>
   <w:num w:numId="1" w16cid:durableId="920943577">
     <w:abstractNumId w:val="0"/>
+  </w:num>
+  <w:num w:numId="2" w16cid:durableId="1772972445">
+    <w:abstractNumId w:val="2"/>
+  </w:num>
+  <w:num w:numId="3" w16cid:durableId="933391875">
+    <w:abstractNumId w:val="1"/>
   </w:num>
 </w:numbering>
 </file>
@@ -2287,6 +2367,7 @@
   <w:style w:type="character" w:default="1" w:styleId="FontParagrafDefault">
     <w:name w:val="Default Paragraph Font"/>
     <w:uiPriority w:val="1"/>
+    <w:semiHidden/>
     <w:unhideWhenUsed/>
   </w:style>
   <w:style w:type="table" w:default="1" w:styleId="TabelNormal">

</xml_diff>